<commit_message>
- Fix User Service await command - Update Identity.docx file
</commit_message>
<xml_diff>
--- a/Project-Analysis/Features/Identity.docx
+++ b/Project-Analysis/Features/Identity.docx
@@ -1757,6 +1757,18 @@
         </w:numPr>
       </w:pPr>
       <w:r>
+        <w:t>Validate the Object Model Annotation of the “RegisterRequest” object</w:t>
+      </w:r>
+    </w:p>
+    <w:p>
+      <w:pPr>
+        <w:pStyle w:val="ListParagraph"/>
+        <w:numPr>
+          <w:ilvl w:val="2"/>
+          <w:numId w:val="7"/>
+        </w:numPr>
+      </w:pPr>
+      <w:r>
         <w:t xml:space="preserve">The Register method then pass the “RegisterRequest” object into </w:t>
       </w:r>
       <w:r>
@@ -1773,62 +1785,71 @@
         </w:numPr>
       </w:pPr>
       <w:r>
-        <w:t>The “RegisterRequest” object then mapped into “RegisterValidatedUserDto” object before validating</w:t>
-      </w:r>
-    </w:p>
-    <w:p>
-      <w:pPr>
-        <w:pStyle w:val="ListParagraph"/>
-        <w:numPr>
-          <w:ilvl w:val="2"/>
-          <w:numId w:val="7"/>
-        </w:numPr>
-      </w:pPr>
-      <w:r>
-        <w:t>We then validate The “RegisterValidatedUserDto” object with “System.ComponentModel.DataAnnotation.Validator” and “IpasswordValidator” object to validate the attributes and the password of the new user</w:t>
-      </w:r>
-    </w:p>
-    <w:p>
-      <w:pPr>
-        <w:pStyle w:val="ListParagraph"/>
-        <w:numPr>
-          <w:ilvl w:val="2"/>
-          <w:numId w:val="7"/>
-        </w:numPr>
-      </w:pPr>
-      <w:r>
-        <w:t>Then we map “RegisterValidateUserDto” into “AppUser”</w:t>
-      </w:r>
-    </w:p>
-    <w:p>
-      <w:pPr>
-        <w:pStyle w:val="ListParagraph"/>
-        <w:numPr>
-          <w:ilvl w:val="2"/>
-          <w:numId w:val="7"/>
-        </w:numPr>
-      </w:pPr>
+        <w:t>The “RegisterRequest” object then mapped into “</w:t>
+      </w:r>
+      <w:r>
+        <w:t>AppUser</w:t>
+      </w:r>
+      <w:r>
+        <w:t>” object</w:t>
+      </w:r>
+    </w:p>
+    <w:p>
+      <w:pPr>
+        <w:pStyle w:val="ListParagraph"/>
+        <w:numPr>
+          <w:ilvl w:val="2"/>
+          <w:numId w:val="7"/>
+        </w:numPr>
+      </w:pPr>
+      <w:r>
+        <w:t>we pass the “AppUser” object as a parameter of the “CreateAsync” method of ASP.NET Core Identity’s “UserManager” class to create new user</w:t>
+      </w:r>
+    </w:p>
+    <w:p>
+      <w:pPr>
+        <w:pStyle w:val="ListParagraph"/>
+        <w:numPr>
+          <w:ilvl w:val="2"/>
+          <w:numId w:val="7"/>
+        </w:numPr>
+      </w:pPr>
+      <w:r>
+        <w:t>We then send a confirmation email to</w:t>
+      </w:r>
+      <w:r>
+        <w:t xml:space="preserve"> the new user’s email</w:t>
+      </w:r>
+      <w:r>
+        <w:t xml:space="preserve"> by passing the user’s email</w:t>
+      </w:r>
+      <w:r>
+        <w:t xml:space="preserve"> and newly created confirmation email token</w:t>
+      </w:r>
+      <w:r>
+        <w:t xml:space="preserve"> to </w:t>
+      </w:r>
+      <w:r>
+        <w:t xml:space="preserve">“IemailTaskQueue” queue method “EnqueueEmailAsync” to send it </w:t>
+      </w:r>
       <w:r>
         <w:lastRenderedPageBreak/>
-        <w:t>we pass the “AppUser” object as a parameter of the “CreateAsync” method of ASP.NET Core Identity’s “UserManager” class to create new user</w:t>
-      </w:r>
-    </w:p>
-    <w:p>
-      <w:pPr>
-        <w:pStyle w:val="ListParagraph"/>
-        <w:numPr>
-          <w:ilvl w:val="2"/>
-          <w:numId w:val="7"/>
-        </w:numPr>
-      </w:pPr>
-      <w:r>
-        <w:t>We then send a confirmation email to</w:t>
-      </w:r>
-      <w:r>
-        <w:t xml:space="preserve"> the new user’s email</w:t>
-      </w:r>
-      <w:r>
-        <w:t xml:space="preserve"> by passing the user’s email to “EmailService”’s method “SendConfirmationEmailAsync”</w:t>
+        <w:t>into a “Channel” queue inside “EmailBackgroundWorker” background worker</w:t>
+      </w:r>
+    </w:p>
+    <w:p>
+      <w:pPr>
+        <w:pStyle w:val="ListParagraph"/>
+        <w:numPr>
+          <w:ilvl w:val="2"/>
+          <w:numId w:val="7"/>
+        </w:numPr>
+      </w:pPr>
+      <w:r>
+        <w:t xml:space="preserve">Next time the “EmailBackgroundWorker” runs, it will read all emails inside the “Channel” queue and pass the email and url into </w:t>
+      </w:r>
+      <w:r>
+        <w:t>“EmailService”’s method “SendConfirmationEmailAsync”</w:t>
       </w:r>
     </w:p>
     <w:p>
@@ -2177,8 +2198,112 @@
         </w:numPr>
       </w:pPr>
       <w:r>
+        <w:t>Respond Handling: How frontent react to server’s response</w:t>
+      </w:r>
+    </w:p>
+    <w:p>
+      <w:pPr>
+        <w:pStyle w:val="ListParagraph"/>
+        <w:numPr>
+          <w:ilvl w:val="0"/>
+          <w:numId w:val="7"/>
+        </w:numPr>
+        <w:rPr>
+          <w:b/>
+          <w:bCs/>
+        </w:rPr>
+      </w:pPr>
+      <w:r>
+        <w:rPr>
+          <w:b/>
+          <w:bCs/>
+        </w:rPr>
         <w:lastRenderedPageBreak/>
-        <w:t>Respond Handling: How frontent react to server’s response</w:t>
+        <w:t xml:space="preserve">OTP Login: </w:t>
+      </w:r>
+    </w:p>
+    <w:p>
+      <w:pPr>
+        <w:pStyle w:val="ListParagraph"/>
+        <w:numPr>
+          <w:ilvl w:val="1"/>
+          <w:numId w:val="7"/>
+        </w:numPr>
+      </w:pPr>
+      <w:r>
+        <w:t>API Endpoint: POST /api/Identity/user/otp-login</w:t>
+      </w:r>
+    </w:p>
+    <w:p>
+      <w:pPr>
+        <w:pStyle w:val="ListParagraph"/>
+        <w:numPr>
+          <w:ilvl w:val="1"/>
+          <w:numId w:val="7"/>
+        </w:numPr>
+      </w:pPr>
+      <w:r>
+        <w:t>Request Payload:</w:t>
+      </w:r>
+    </w:p>
+    <w:p>
+      <w:pPr>
+        <w:pStyle w:val="ListParagraph"/>
+        <w:numPr>
+          <w:ilvl w:val="2"/>
+          <w:numId w:val="7"/>
+        </w:numPr>
+      </w:pPr>
+      <w:r>
+        <w:t>{</w:t>
+      </w:r>
+    </w:p>
+    <w:p>
+      <w:pPr>
+        <w:pStyle w:val="ListParagraph"/>
+        <w:numPr>
+          <w:ilvl w:val="2"/>
+          <w:numId w:val="7"/>
+        </w:numPr>
+      </w:pPr>
+      <w:r>
+        <w:t>"email": "string",</w:t>
+      </w:r>
+    </w:p>
+    <w:p>
+      <w:pPr>
+        <w:pStyle w:val="ListParagraph"/>
+        <w:numPr>
+          <w:ilvl w:val="2"/>
+          <w:numId w:val="7"/>
+        </w:numPr>
+      </w:pPr>
+      <w:r>
+        <w:t>"otp": "string"</w:t>
+      </w:r>
+    </w:p>
+    <w:p>
+      <w:pPr>
+        <w:pStyle w:val="ListParagraph"/>
+        <w:numPr>
+          <w:ilvl w:val="2"/>
+          <w:numId w:val="7"/>
+        </w:numPr>
+      </w:pPr>
+      <w:r>
+        <w:t>}</w:t>
+      </w:r>
+    </w:p>
+    <w:p>
+      <w:pPr>
+        <w:pStyle w:val="ListParagraph"/>
+        <w:numPr>
+          <w:ilvl w:val="1"/>
+          <w:numId w:val="7"/>
+        </w:numPr>
+      </w:pPr>
+      <w:r>
+        <w:t>Respond Handling:</w:t>
       </w:r>
     </w:p>
     <w:p>
@@ -2188,110 +2313,6 @@
           <w:ilvl w:val="0"/>
           <w:numId w:val="7"/>
         </w:numPr>
-        <w:rPr>
-          <w:b/>
-          <w:bCs/>
-        </w:rPr>
-      </w:pPr>
-      <w:r>
-        <w:rPr>
-          <w:b/>
-          <w:bCs/>
-        </w:rPr>
-        <w:t xml:space="preserve">OTP Login: </w:t>
-      </w:r>
-    </w:p>
-    <w:p>
-      <w:pPr>
-        <w:pStyle w:val="ListParagraph"/>
-        <w:numPr>
-          <w:ilvl w:val="1"/>
-          <w:numId w:val="7"/>
-        </w:numPr>
-      </w:pPr>
-      <w:r>
-        <w:t>API Endpoint: POST /api/Identity/user/otp-login</w:t>
-      </w:r>
-    </w:p>
-    <w:p>
-      <w:pPr>
-        <w:pStyle w:val="ListParagraph"/>
-        <w:numPr>
-          <w:ilvl w:val="1"/>
-          <w:numId w:val="7"/>
-        </w:numPr>
-      </w:pPr>
-      <w:r>
-        <w:t>Request Payload:</w:t>
-      </w:r>
-    </w:p>
-    <w:p>
-      <w:pPr>
-        <w:pStyle w:val="ListParagraph"/>
-        <w:numPr>
-          <w:ilvl w:val="2"/>
-          <w:numId w:val="7"/>
-        </w:numPr>
-      </w:pPr>
-      <w:r>
-        <w:t>{</w:t>
-      </w:r>
-    </w:p>
-    <w:p>
-      <w:pPr>
-        <w:pStyle w:val="ListParagraph"/>
-        <w:numPr>
-          <w:ilvl w:val="2"/>
-          <w:numId w:val="7"/>
-        </w:numPr>
-      </w:pPr>
-      <w:r>
-        <w:t>"email": "string",</w:t>
-      </w:r>
-    </w:p>
-    <w:p>
-      <w:pPr>
-        <w:pStyle w:val="ListParagraph"/>
-        <w:numPr>
-          <w:ilvl w:val="2"/>
-          <w:numId w:val="7"/>
-        </w:numPr>
-      </w:pPr>
-      <w:r>
-        <w:t>"otp": "string"</w:t>
-      </w:r>
-    </w:p>
-    <w:p>
-      <w:pPr>
-        <w:pStyle w:val="ListParagraph"/>
-        <w:numPr>
-          <w:ilvl w:val="2"/>
-          <w:numId w:val="7"/>
-        </w:numPr>
-      </w:pPr>
-      <w:r>
-        <w:t>}</w:t>
-      </w:r>
-    </w:p>
-    <w:p>
-      <w:pPr>
-        <w:pStyle w:val="ListParagraph"/>
-        <w:numPr>
-          <w:ilvl w:val="1"/>
-          <w:numId w:val="7"/>
-        </w:numPr>
-      </w:pPr>
-      <w:r>
-        <w:t>Respond Handling:</w:t>
-      </w:r>
-    </w:p>
-    <w:p>
-      <w:pPr>
-        <w:pStyle w:val="ListParagraph"/>
-        <w:numPr>
-          <w:ilvl w:val="0"/>
-          <w:numId w:val="7"/>
-        </w:numPr>
       </w:pPr>
       <w:r>
         <w:rPr>
@@ -2310,34 +2331,19 @@
         </w:numPr>
       </w:pPr>
       <w:r>
-        <w:t>Controller/Router: The request hits “IdentityController.cs” at the Http</w:t>
-      </w:r>
-      <w:r>
-        <w:t>Get</w:t>
-      </w:r>
-      <w:r>
-        <w:t>(“/api/Identity/user/</w:t>
-      </w:r>
-      <w:r>
-        <w:t>confirm-email?email=string?token=string</w:t>
-      </w:r>
-      <w:r>
-        <w:t>”) endpoint</w:t>
-      </w:r>
-    </w:p>
-    <w:p>
-      <w:pPr>
-        <w:pStyle w:val="ListParagraph"/>
-        <w:numPr>
-          <w:ilvl w:val="2"/>
-          <w:numId w:val="7"/>
-        </w:numPr>
-      </w:pPr>
-      <w:r>
-        <w:t xml:space="preserve">It accepts </w:t>
-      </w:r>
-      <w:r>
-        <w:t>“email” and “token” query parameters</w:t>
+        <w:t>Controller/Router: The request hits “IdentityController.cs” at the HttpGet(“/api/Identity/user/confirm-email?email=string?token=string”) endpoint</w:t>
+      </w:r>
+    </w:p>
+    <w:p>
+      <w:pPr>
+        <w:pStyle w:val="ListParagraph"/>
+        <w:numPr>
+          <w:ilvl w:val="2"/>
+          <w:numId w:val="7"/>
+        </w:numPr>
+      </w:pPr>
+      <w:r>
+        <w:t>It accepts “email” and “token” query parameters</w:t>
       </w:r>
       <w:r>
         <w:t xml:space="preserve"> inside “ConfirmEmailRequest” object</w:t>
@@ -2594,7 +2600,135 @@
         </w:numPr>
       </w:pPr>
       <w:r>
+        <w:t>{</w:t>
+      </w:r>
+    </w:p>
+    <w:p>
+      <w:pPr>
+        <w:pStyle w:val="ListParagraph"/>
+        <w:numPr>
+          <w:ilvl w:val="2"/>
+          <w:numId w:val="7"/>
+        </w:numPr>
+      </w:pPr>
+      <w:r>
         <w:lastRenderedPageBreak/>
+        <w:t>"email": "string",</w:t>
+      </w:r>
+    </w:p>
+    <w:p>
+      <w:pPr>
+        <w:pStyle w:val="ListParagraph"/>
+        <w:numPr>
+          <w:ilvl w:val="2"/>
+          <w:numId w:val="7"/>
+        </w:numPr>
+      </w:pPr>
+      <w:r>
+        <w:t>"phone_number": "string",</w:t>
+      </w:r>
+    </w:p>
+    <w:p>
+      <w:pPr>
+        <w:pStyle w:val="ListParagraph"/>
+        <w:numPr>
+          <w:ilvl w:val="2"/>
+          <w:numId w:val="7"/>
+        </w:numPr>
+      </w:pPr>
+      <w:r>
+        <w:t>"day_of_birth": "2026-03-25T09:03:36.455Z"</w:t>
+      </w:r>
+    </w:p>
+    <w:p>
+      <w:pPr>
+        <w:pStyle w:val="ListParagraph"/>
+        <w:numPr>
+          <w:ilvl w:val="2"/>
+          <w:numId w:val="7"/>
+        </w:numPr>
+      </w:pPr>
+      <w:r>
+        <w:t>}</w:t>
+      </w:r>
+    </w:p>
+    <w:p>
+      <w:pPr>
+        <w:pStyle w:val="ListParagraph"/>
+        <w:numPr>
+          <w:ilvl w:val="1"/>
+          <w:numId w:val="7"/>
+        </w:numPr>
+      </w:pPr>
+      <w:r>
+        <w:t>Respond Handling: How frontent react to server’s response</w:t>
+      </w:r>
+    </w:p>
+    <w:p>
+      <w:pPr>
+        <w:pStyle w:val="ListParagraph"/>
+        <w:numPr>
+          <w:ilvl w:val="0"/>
+          <w:numId w:val="7"/>
+        </w:numPr>
+        <w:rPr>
+          <w:b/>
+          <w:bCs/>
+        </w:rPr>
+      </w:pPr>
+      <w:r>
+        <w:rPr>
+          <w:b/>
+          <w:bCs/>
+        </w:rPr>
+        <w:t xml:space="preserve">Change Password: </w:t>
+      </w:r>
+    </w:p>
+    <w:p>
+      <w:pPr>
+        <w:pStyle w:val="ListParagraph"/>
+        <w:numPr>
+          <w:ilvl w:val="1"/>
+          <w:numId w:val="7"/>
+        </w:numPr>
+      </w:pPr>
+      <w:r>
+        <w:t>API Endpoint: PUT /api/Identity/user/change-password</w:t>
+      </w:r>
+    </w:p>
+    <w:p>
+      <w:pPr>
+        <w:pStyle w:val="ListParagraph"/>
+        <w:numPr>
+          <w:ilvl w:val="1"/>
+          <w:numId w:val="7"/>
+        </w:numPr>
+      </w:pPr>
+      <w:r>
+        <w:t>Authorization: Yes</w:t>
+      </w:r>
+    </w:p>
+    <w:p>
+      <w:pPr>
+        <w:pStyle w:val="ListParagraph"/>
+        <w:numPr>
+          <w:ilvl w:val="1"/>
+          <w:numId w:val="7"/>
+        </w:numPr>
+      </w:pPr>
+      <w:r>
+        <w:t xml:space="preserve">Request Payload: </w:t>
+      </w:r>
+    </w:p>
+    <w:p>
+      <w:pPr>
+        <w:pStyle w:val="ListParagraph"/>
+        <w:numPr>
+          <w:ilvl w:val="2"/>
+          <w:numId w:val="7"/>
+        </w:numPr>
+      </w:pPr>
+      <w:r>
         <w:t>{</w:t>
       </w:r>
     </w:p>
@@ -2607,6 +2741,113 @@
         </w:numPr>
       </w:pPr>
       <w:r>
+        <w:t>"old_password": "string",</w:t>
+      </w:r>
+    </w:p>
+    <w:p>
+      <w:pPr>
+        <w:pStyle w:val="ListParagraph"/>
+        <w:numPr>
+          <w:ilvl w:val="2"/>
+          <w:numId w:val="7"/>
+        </w:numPr>
+      </w:pPr>
+      <w:r>
+        <w:t>"new_password": "string"</w:t>
+      </w:r>
+    </w:p>
+    <w:p>
+      <w:pPr>
+        <w:pStyle w:val="ListParagraph"/>
+        <w:numPr>
+          <w:ilvl w:val="2"/>
+          <w:numId w:val="7"/>
+        </w:numPr>
+      </w:pPr>
+      <w:r>
+        <w:t>}</w:t>
+      </w:r>
+    </w:p>
+    <w:p>
+      <w:pPr>
+        <w:pStyle w:val="ListParagraph"/>
+        <w:numPr>
+          <w:ilvl w:val="1"/>
+          <w:numId w:val="7"/>
+        </w:numPr>
+      </w:pPr>
+      <w:r>
+        <w:t>Respond Handling: How frontent react to server’s response</w:t>
+      </w:r>
+    </w:p>
+    <w:p>
+      <w:pPr>
+        <w:pStyle w:val="ListParagraph"/>
+        <w:numPr>
+          <w:ilvl w:val="0"/>
+          <w:numId w:val="7"/>
+        </w:numPr>
+        <w:rPr>
+          <w:b/>
+          <w:bCs/>
+        </w:rPr>
+      </w:pPr>
+      <w:r>
+        <w:rPr>
+          <w:b/>
+          <w:bCs/>
+        </w:rPr>
+        <w:t xml:space="preserve">Forgot Password: </w:t>
+      </w:r>
+    </w:p>
+    <w:p>
+      <w:pPr>
+        <w:pStyle w:val="ListParagraph"/>
+        <w:numPr>
+          <w:ilvl w:val="1"/>
+          <w:numId w:val="7"/>
+        </w:numPr>
+      </w:pPr>
+      <w:r>
+        <w:t>API Endpoint: POST /api/Identity/user/forgot-password</w:t>
+      </w:r>
+      <w:r>
+        <w:tab/>
+      </w:r>
+    </w:p>
+    <w:p>
+      <w:pPr>
+        <w:pStyle w:val="ListParagraph"/>
+        <w:numPr>
+          <w:ilvl w:val="1"/>
+          <w:numId w:val="7"/>
+        </w:numPr>
+      </w:pPr>
+      <w:r>
+        <w:t xml:space="preserve">Request Payload: </w:t>
+      </w:r>
+    </w:p>
+    <w:p>
+      <w:pPr>
+        <w:pStyle w:val="ListParagraph"/>
+        <w:numPr>
+          <w:ilvl w:val="2"/>
+          <w:numId w:val="7"/>
+        </w:numPr>
+      </w:pPr>
+      <w:r>
+        <w:t>{</w:t>
+      </w:r>
+    </w:p>
+    <w:p>
+      <w:pPr>
+        <w:pStyle w:val="ListParagraph"/>
+        <w:numPr>
+          <w:ilvl w:val="2"/>
+          <w:numId w:val="7"/>
+        </w:numPr>
+      </w:pPr>
+      <w:r>
         <w:t>"email": "string",</w:t>
       </w:r>
     </w:p>
@@ -2619,19 +2860,7 @@
         </w:numPr>
       </w:pPr>
       <w:r>
-        <w:t>"phone_number": "string",</w:t>
-      </w:r>
-    </w:p>
-    <w:p>
-      <w:pPr>
-        <w:pStyle w:val="ListParagraph"/>
-        <w:numPr>
-          <w:ilvl w:val="2"/>
-          <w:numId w:val="7"/>
-        </w:numPr>
-      </w:pPr>
-      <w:r>
-        <w:t>"day_of_birth": "2026-03-25T09:03:36.455Z"</w:t>
+        <w:t>"redirectUrl": "string"</w:t>
       </w:r>
     </w:p>
     <w:p>
@@ -2675,31 +2904,19 @@
           <w:b/>
           <w:bCs/>
         </w:rPr>
-        <w:t xml:space="preserve">Change Password: </w:t>
-      </w:r>
-    </w:p>
-    <w:p>
-      <w:pPr>
-        <w:pStyle w:val="ListParagraph"/>
-        <w:numPr>
-          <w:ilvl w:val="1"/>
-          <w:numId w:val="7"/>
-        </w:numPr>
-      </w:pPr>
-      <w:r>
-        <w:t>API Endpoint: PUT /api/Identity/user/change-password</w:t>
-      </w:r>
-    </w:p>
-    <w:p>
-      <w:pPr>
-        <w:pStyle w:val="ListParagraph"/>
-        <w:numPr>
-          <w:ilvl w:val="1"/>
-          <w:numId w:val="7"/>
-        </w:numPr>
-      </w:pPr>
-      <w:r>
-        <w:t>Authorization: Yes</w:t>
+        <w:t xml:space="preserve">Reset Password: </w:t>
+      </w:r>
+    </w:p>
+    <w:p>
+      <w:pPr>
+        <w:pStyle w:val="ListParagraph"/>
+        <w:numPr>
+          <w:ilvl w:val="1"/>
+          <w:numId w:val="7"/>
+        </w:numPr>
+      </w:pPr>
+      <w:r>
+        <w:t>API Endpoint: POST /api/Identity/user/reset-password</w:t>
       </w:r>
     </w:p>
     <w:p>
@@ -2735,19 +2952,43 @@
         </w:numPr>
       </w:pPr>
       <w:r>
-        <w:t>"old_password": "string",</w:t>
-      </w:r>
-    </w:p>
-    <w:p>
-      <w:pPr>
-        <w:pStyle w:val="ListParagraph"/>
-        <w:numPr>
-          <w:ilvl w:val="2"/>
-          <w:numId w:val="7"/>
-        </w:numPr>
-      </w:pPr>
-      <w:r>
-        <w:t>"new_password": "string"</w:t>
+        <w:t>"email": "string",</w:t>
+      </w:r>
+    </w:p>
+    <w:p>
+      <w:pPr>
+        <w:pStyle w:val="ListParagraph"/>
+        <w:numPr>
+          <w:ilvl w:val="2"/>
+          <w:numId w:val="7"/>
+        </w:numPr>
+      </w:pPr>
+      <w:r>
+        <w:t>"password": "string",</w:t>
+      </w:r>
+    </w:p>
+    <w:p>
+      <w:pPr>
+        <w:pStyle w:val="ListParagraph"/>
+        <w:numPr>
+          <w:ilvl w:val="2"/>
+          <w:numId w:val="7"/>
+        </w:numPr>
+      </w:pPr>
+      <w:r>
+        <w:t>"confirm_password": "string",</w:t>
+      </w:r>
+    </w:p>
+    <w:p>
+      <w:pPr>
+        <w:pStyle w:val="ListParagraph"/>
+        <w:numPr>
+          <w:ilvl w:val="2"/>
+          <w:numId w:val="7"/>
+        </w:numPr>
+      </w:pPr>
+      <w:r>
+        <w:t>"token": "string"</w:t>
       </w:r>
     </w:p>
     <w:p>
@@ -2791,82 +3032,43 @@
           <w:b/>
           <w:bCs/>
         </w:rPr>
-        <w:t xml:space="preserve">Forgot Password: </w:t>
-      </w:r>
-    </w:p>
-    <w:p>
-      <w:pPr>
-        <w:pStyle w:val="ListParagraph"/>
-        <w:numPr>
-          <w:ilvl w:val="1"/>
-          <w:numId w:val="7"/>
-        </w:numPr>
-      </w:pPr>
-      <w:r>
-        <w:t>API Endpoint: POST /api/Identity/user/forgot-password</w:t>
-      </w:r>
-      <w:r>
-        <w:tab/>
-      </w:r>
-    </w:p>
-    <w:p>
-      <w:pPr>
-        <w:pStyle w:val="ListParagraph"/>
-        <w:numPr>
-          <w:ilvl w:val="1"/>
-          <w:numId w:val="7"/>
-        </w:numPr>
-      </w:pPr>
-      <w:r>
-        <w:t xml:space="preserve">Request Payload: </w:t>
-      </w:r>
-    </w:p>
-    <w:p>
-      <w:pPr>
-        <w:pStyle w:val="ListParagraph"/>
-        <w:numPr>
-          <w:ilvl w:val="2"/>
-          <w:numId w:val="7"/>
-        </w:numPr>
-      </w:pPr>
-      <w:r>
-        <w:t>{</w:t>
-      </w:r>
-    </w:p>
-    <w:p>
-      <w:pPr>
-        <w:pStyle w:val="ListParagraph"/>
-        <w:numPr>
-          <w:ilvl w:val="2"/>
-          <w:numId w:val="7"/>
-        </w:numPr>
-      </w:pPr>
-      <w:r>
-        <w:t>"email": "string",</w:t>
-      </w:r>
-    </w:p>
-    <w:p>
-      <w:pPr>
-        <w:pStyle w:val="ListParagraph"/>
-        <w:numPr>
-          <w:ilvl w:val="2"/>
-          <w:numId w:val="7"/>
-        </w:numPr>
-      </w:pPr>
-      <w:r>
-        <w:t>"redirectUrl": "string"</w:t>
-      </w:r>
-    </w:p>
-    <w:p>
-      <w:pPr>
-        <w:pStyle w:val="ListParagraph"/>
-        <w:numPr>
-          <w:ilvl w:val="2"/>
-          <w:numId w:val="7"/>
-        </w:numPr>
-      </w:pPr>
-      <w:r>
-        <w:t>}</w:t>
+        <w:t xml:space="preserve">Get User Info: </w:t>
+      </w:r>
+    </w:p>
+    <w:p>
+      <w:pPr>
+        <w:pStyle w:val="ListParagraph"/>
+        <w:numPr>
+          <w:ilvl w:val="1"/>
+          <w:numId w:val="7"/>
+        </w:numPr>
+      </w:pPr>
+      <w:r>
+        <w:t>API Endpoint: GET /api/Identity/user/get-user-info</w:t>
+      </w:r>
+    </w:p>
+    <w:p>
+      <w:pPr>
+        <w:pStyle w:val="ListParagraph"/>
+        <w:numPr>
+          <w:ilvl w:val="1"/>
+          <w:numId w:val="7"/>
+        </w:numPr>
+      </w:pPr>
+      <w:r>
+        <w:t>Authorization: yes</w:t>
+      </w:r>
+    </w:p>
+    <w:p>
+      <w:pPr>
+        <w:pStyle w:val="ListParagraph"/>
+        <w:numPr>
+          <w:ilvl w:val="1"/>
+          <w:numId w:val="7"/>
+        </w:numPr>
+      </w:pPr>
+      <w:r>
+        <w:t>Request Payload: None</w:t>
       </w:r>
     </w:p>
     <w:p>
@@ -2898,215 +3100,19 @@
           <w:b/>
           <w:bCs/>
         </w:rPr>
-        <w:t xml:space="preserve">Reset Password: </w:t>
-      </w:r>
-    </w:p>
-    <w:p>
-      <w:pPr>
-        <w:pStyle w:val="ListParagraph"/>
-        <w:numPr>
-          <w:ilvl w:val="1"/>
-          <w:numId w:val="7"/>
-        </w:numPr>
-      </w:pPr>
-      <w:r>
-        <w:t>API Endpoint: POST /api/Identity/user/reset-password</w:t>
-      </w:r>
-    </w:p>
-    <w:p>
-      <w:pPr>
-        <w:pStyle w:val="ListParagraph"/>
-        <w:numPr>
-          <w:ilvl w:val="1"/>
-          <w:numId w:val="7"/>
-        </w:numPr>
-      </w:pPr>
-      <w:r>
-        <w:t xml:space="preserve">Request Payload: </w:t>
-      </w:r>
-    </w:p>
-    <w:p>
-      <w:pPr>
-        <w:pStyle w:val="ListParagraph"/>
-        <w:numPr>
-          <w:ilvl w:val="2"/>
-          <w:numId w:val="7"/>
-        </w:numPr>
-      </w:pPr>
-      <w:r>
-        <w:t>{</w:t>
-      </w:r>
-    </w:p>
-    <w:p>
-      <w:pPr>
-        <w:pStyle w:val="ListParagraph"/>
-        <w:numPr>
-          <w:ilvl w:val="2"/>
-          <w:numId w:val="7"/>
-        </w:numPr>
-      </w:pPr>
-      <w:r>
-        <w:t>"email": "string",</w:t>
-      </w:r>
-    </w:p>
-    <w:p>
-      <w:pPr>
-        <w:pStyle w:val="ListParagraph"/>
-        <w:numPr>
-          <w:ilvl w:val="2"/>
-          <w:numId w:val="7"/>
-        </w:numPr>
-      </w:pPr>
-      <w:r>
-        <w:t>"password": "string",</w:t>
-      </w:r>
-    </w:p>
-    <w:p>
-      <w:pPr>
-        <w:pStyle w:val="ListParagraph"/>
-        <w:numPr>
-          <w:ilvl w:val="2"/>
-          <w:numId w:val="7"/>
-        </w:numPr>
-      </w:pPr>
-      <w:r>
-        <w:t>"confirm_password": "string",</w:t>
-      </w:r>
-    </w:p>
-    <w:p>
-      <w:pPr>
-        <w:pStyle w:val="ListParagraph"/>
-        <w:numPr>
-          <w:ilvl w:val="2"/>
-          <w:numId w:val="7"/>
-        </w:numPr>
-      </w:pPr>
-      <w:r>
-        <w:t>"token": "string"</w:t>
-      </w:r>
-    </w:p>
-    <w:p>
-      <w:pPr>
-        <w:pStyle w:val="ListParagraph"/>
-        <w:numPr>
-          <w:ilvl w:val="2"/>
-          <w:numId w:val="7"/>
-        </w:numPr>
-      </w:pPr>
-      <w:r>
-        <w:t>}</w:t>
-      </w:r>
-    </w:p>
-    <w:p>
-      <w:pPr>
-        <w:pStyle w:val="ListParagraph"/>
-        <w:numPr>
-          <w:ilvl w:val="1"/>
-          <w:numId w:val="7"/>
-        </w:numPr>
-      </w:pPr>
-      <w:r>
-        <w:t>Respond Handling: How frontent react to server’s response</w:t>
-      </w:r>
-    </w:p>
-    <w:p>
-      <w:pPr>
-        <w:pStyle w:val="ListParagraph"/>
-        <w:numPr>
-          <w:ilvl w:val="0"/>
-          <w:numId w:val="7"/>
-        </w:numPr>
-        <w:rPr>
-          <w:b/>
-          <w:bCs/>
-        </w:rPr>
-      </w:pPr>
-      <w:r>
-        <w:rPr>
-          <w:b/>
-          <w:bCs/>
-        </w:rPr>
-        <w:t xml:space="preserve">Get User Info: </w:t>
-      </w:r>
-    </w:p>
-    <w:p>
-      <w:pPr>
-        <w:pStyle w:val="ListParagraph"/>
-        <w:numPr>
-          <w:ilvl w:val="1"/>
-          <w:numId w:val="7"/>
-        </w:numPr>
-      </w:pPr>
-      <w:r>
-        <w:t>API Endpoint: GET /api/Identity/user/get-user-info</w:t>
-      </w:r>
-    </w:p>
-    <w:p>
-      <w:pPr>
-        <w:pStyle w:val="ListParagraph"/>
-        <w:numPr>
-          <w:ilvl w:val="1"/>
-          <w:numId w:val="7"/>
-        </w:numPr>
-      </w:pPr>
-      <w:r>
-        <w:t>Authorization: yes</w:t>
-      </w:r>
-    </w:p>
-    <w:p>
-      <w:pPr>
-        <w:pStyle w:val="ListParagraph"/>
-        <w:numPr>
-          <w:ilvl w:val="1"/>
-          <w:numId w:val="7"/>
-        </w:numPr>
-      </w:pPr>
-      <w:r>
-        <w:t>Request Payload: None</w:t>
-      </w:r>
-    </w:p>
-    <w:p>
-      <w:pPr>
-        <w:pStyle w:val="ListParagraph"/>
-        <w:numPr>
-          <w:ilvl w:val="1"/>
-          <w:numId w:val="7"/>
-        </w:numPr>
-      </w:pPr>
-      <w:r>
-        <w:t>Respond Handling: How frontent react to server’s response</w:t>
-      </w:r>
-    </w:p>
-    <w:p>
-      <w:pPr>
-        <w:pStyle w:val="ListParagraph"/>
-        <w:numPr>
-          <w:ilvl w:val="0"/>
-          <w:numId w:val="7"/>
-        </w:numPr>
-        <w:rPr>
-          <w:b/>
-          <w:bCs/>
-        </w:rPr>
-      </w:pPr>
-      <w:r>
-        <w:rPr>
-          <w:b/>
-          <w:bCs/>
-        </w:rPr>
+        <w:t xml:space="preserve">Get User by ID: </w:t>
+      </w:r>
+    </w:p>
+    <w:p>
+      <w:pPr>
+        <w:pStyle w:val="ListParagraph"/>
+        <w:numPr>
+          <w:ilvl w:val="1"/>
+          <w:numId w:val="7"/>
+        </w:numPr>
+      </w:pPr>
+      <w:r>
         <w:lastRenderedPageBreak/>
-        <w:t xml:space="preserve">Get User by ID: </w:t>
-      </w:r>
-    </w:p>
-    <w:p>
-      <w:pPr>
-        <w:pStyle w:val="ListParagraph"/>
-        <w:numPr>
-          <w:ilvl w:val="1"/>
-          <w:numId w:val="7"/>
-        </w:numPr>
-      </w:pPr>
-      <w:r>
         <w:t>API Endpoint: GET /api/Identity/users/{id}</w:t>
       </w:r>
     </w:p>
@@ -3269,86 +3275,83 @@
         </w:numPr>
       </w:pPr>
       <w:r>
-        <w:t>Database Interaction</w:t>
+        <w:t xml:space="preserve">Database Interaction: </w:t>
+      </w:r>
+      <w:r>
+        <w:t>Create a new record in [Identity].[AspNetUsers] for new user and a new record in [Identity].[UserLicen</w:t>
+      </w:r>
+      <w:r>
+        <w:t>s</w:t>
+      </w:r>
+      <w:r>
+        <w:t>ePlates] for the plates of that new user</w:t>
+      </w:r>
+    </w:p>
+    <w:p>
+      <w:pPr>
+        <w:pStyle w:val="ListParagraph"/>
+        <w:numPr>
+          <w:ilvl w:val="1"/>
+          <w:numId w:val="4"/>
+        </w:numPr>
+      </w:pPr>
+      <w:r>
+        <w:t>Queries/ORMs</w:t>
       </w:r>
       <w:r>
         <w:t xml:space="preserve">: </w:t>
       </w:r>
-      <w:r>
-        <w:t>Create a new record in [Identity].[AspNetUsers] for new user and a new record in [Identity].[UserLicen</w:t>
-      </w:r>
-      <w:r>
-        <w:t>s</w:t>
-      </w:r>
-      <w:r>
-        <w:t>ePlates] for the plates of that new user</w:t>
-      </w:r>
-    </w:p>
-    <w:p>
-      <w:pPr>
-        <w:pStyle w:val="ListParagraph"/>
-        <w:numPr>
-          <w:ilvl w:val="1"/>
-          <w:numId w:val="4"/>
-        </w:numPr>
-      </w:pPr>
-      <w:r>
-        <w:t>Queries/ORMs</w:t>
+    </w:p>
+    <w:p>
+      <w:pPr>
+        <w:pStyle w:val="ListParagraph"/>
+        <w:numPr>
+          <w:ilvl w:val="2"/>
+          <w:numId w:val="5"/>
+        </w:numPr>
+      </w:pPr>
+      <w:r>
+        <w:t>Query 1: “SELECT” query to verify that the NormalizedUsername of the new user is in the database or not.</w:t>
+      </w:r>
+    </w:p>
+    <w:p>
+      <w:pPr>
+        <w:pStyle w:val="ListParagraph"/>
+        <w:numPr>
+          <w:ilvl w:val="2"/>
+          <w:numId w:val="5"/>
+        </w:numPr>
+      </w:pPr>
+      <w:r>
+        <w:t>Query 2: An “INSERT” statement that insert a new record into [Identity].[AspNetUsers] column</w:t>
+      </w:r>
+    </w:p>
+    <w:p>
+      <w:pPr>
+        <w:pStyle w:val="ListParagraph"/>
+        <w:numPr>
+          <w:ilvl w:val="2"/>
+          <w:numId w:val="5"/>
+        </w:numPr>
+      </w:pPr>
+      <w:r>
+        <w:t>Query 3: An “INSERT” statement that insert a new record into [Identity].[UserLicensePlates]</w:t>
+      </w:r>
+    </w:p>
+    <w:p>
+      <w:pPr>
+        <w:pStyle w:val="ListParagraph"/>
+        <w:numPr>
+          <w:ilvl w:val="1"/>
+          <w:numId w:val="4"/>
+        </w:numPr>
+      </w:pPr>
+      <w:r>
+        <w:t>External Services</w:t>
       </w:r>
       <w:r>
         <w:t xml:space="preserve">: </w:t>
       </w:r>
-    </w:p>
-    <w:p>
-      <w:pPr>
-        <w:pStyle w:val="ListParagraph"/>
-        <w:numPr>
-          <w:ilvl w:val="2"/>
-          <w:numId w:val="5"/>
-        </w:numPr>
-      </w:pPr>
-      <w:r>
-        <w:t>Query 1: “SELECT” query to verify that the NormalizedUsername of the new user is in the database or not.</w:t>
-      </w:r>
-    </w:p>
-    <w:p>
-      <w:pPr>
-        <w:pStyle w:val="ListParagraph"/>
-        <w:numPr>
-          <w:ilvl w:val="2"/>
-          <w:numId w:val="5"/>
-        </w:numPr>
-      </w:pPr>
-      <w:r>
-        <w:t>Query 2: An “INSERT” statement that insert a new record into [Identity].[AspNetUsers] column</w:t>
-      </w:r>
-    </w:p>
-    <w:p>
-      <w:pPr>
-        <w:pStyle w:val="ListParagraph"/>
-        <w:numPr>
-          <w:ilvl w:val="2"/>
-          <w:numId w:val="5"/>
-        </w:numPr>
-      </w:pPr>
-      <w:r>
-        <w:t>Query 3: An “INSERT” statement that insert a new record into [Identity].[UserLicensePlates]</w:t>
-      </w:r>
-    </w:p>
-    <w:p>
-      <w:pPr>
-        <w:pStyle w:val="ListParagraph"/>
-        <w:numPr>
-          <w:ilvl w:val="1"/>
-          <w:numId w:val="4"/>
-        </w:numPr>
-      </w:pPr>
-      <w:r>
-        <w:t>External Services</w:t>
-      </w:r>
-      <w:r>
-        <w:t xml:space="preserve">: </w:t>
-      </w:r>
       <w:r>
         <w:t>Sending a confirmation email into the new user’s email</w:t>
       </w:r>
@@ -3537,19 +3540,19 @@
         </w:numPr>
       </w:pPr>
       <w:r>
+        <w:t>Login by Username:</w:t>
+      </w:r>
+    </w:p>
+    <w:p>
+      <w:pPr>
+        <w:pStyle w:val="ListParagraph"/>
+        <w:numPr>
+          <w:ilvl w:val="3"/>
+          <w:numId w:val="4"/>
+        </w:numPr>
+      </w:pPr>
+      <w:r>
         <w:lastRenderedPageBreak/>
-        <w:t>Login by Username:</w:t>
-      </w:r>
-    </w:p>
-    <w:p>
-      <w:pPr>
-        <w:pStyle w:val="ListParagraph"/>
-        <w:numPr>
-          <w:ilvl w:val="3"/>
-          <w:numId w:val="4"/>
-        </w:numPr>
-      </w:pPr>
-      <w:r>
         <w:t>{</w:t>
       </w:r>
     </w:p>
@@ -3854,25 +3857,13 @@
         <w:t xml:space="preserve">Query 2: </w:t>
       </w:r>
       <w:r>
-        <w:t>a</w:t>
-      </w:r>
-      <w:r>
-        <w:t xml:space="preserve"> “SELECT” query to database to get top </w:t>
-      </w:r>
-      <w:r>
-        <w:t>1</w:t>
+        <w:t>a “SELECT” query to database to get top 1</w:t>
       </w:r>
       <w:r>
         <w:t xml:space="preserve"> </w:t>
       </w:r>
       <w:r>
-        <w:t>result that have the same “NormalizedUserName” as the confirm email user. In LINQ, it is the “</w:t>
-      </w:r>
-      <w:r>
-        <w:t>First</w:t>
-      </w:r>
-      <w:r>
-        <w:t>OrDefaultAsync()” method.</w:t>
+        <w:t>result that have the same “NormalizedUserName” as the confirm email user. In LINQ, it is the “FirstOrDefaultAsync()” method.</w:t>
       </w:r>
       <w:r>
         <w:t xml:space="preserve"> It is executed to check whether the username in token is valid or not</w:t>
@@ -3979,7 +3970,114 @@
         </w:numPr>
       </w:pPr>
       <w:r>
+        <w:t xml:space="preserve">Request Payload: </w:t>
+      </w:r>
+    </w:p>
+    <w:p>
+      <w:pPr>
+        <w:pStyle w:val="ListParagraph"/>
+        <w:numPr>
+          <w:ilvl w:val="2"/>
+          <w:numId w:val="4"/>
+        </w:numPr>
+      </w:pPr>
+      <w:r>
         <w:lastRenderedPageBreak/>
+        <w:t>{</w:t>
+      </w:r>
+    </w:p>
+    <w:p>
+      <w:pPr>
+        <w:pStyle w:val="ListParagraph"/>
+        <w:numPr>
+          <w:ilvl w:val="2"/>
+          <w:numId w:val="4"/>
+        </w:numPr>
+      </w:pPr>
+      <w:r>
+        <w:t>"email": "string"</w:t>
+      </w:r>
+    </w:p>
+    <w:p>
+      <w:pPr>
+        <w:pStyle w:val="ListParagraph"/>
+        <w:numPr>
+          <w:ilvl w:val="2"/>
+          <w:numId w:val="4"/>
+        </w:numPr>
+      </w:pPr>
+      <w:r>
+        <w:t>}</w:t>
+      </w:r>
+    </w:p>
+    <w:p>
+      <w:pPr>
+        <w:pStyle w:val="ListParagraph"/>
+        <w:numPr>
+          <w:ilvl w:val="1"/>
+          <w:numId w:val="4"/>
+        </w:numPr>
+      </w:pPr>
+      <w:r>
+        <w:t>Respond Handling: How frontent react to server’s response</w:t>
+      </w:r>
+    </w:p>
+    <w:p>
+      <w:pPr>
+        <w:pStyle w:val="ListParagraph"/>
+        <w:numPr>
+          <w:ilvl w:val="0"/>
+          <w:numId w:val="4"/>
+        </w:numPr>
+        <w:rPr>
+          <w:b/>
+          <w:bCs/>
+        </w:rPr>
+      </w:pPr>
+      <w:r>
+        <w:rPr>
+          <w:b/>
+          <w:bCs/>
+        </w:rPr>
+        <w:t xml:space="preserve">Update Profile: </w:t>
+      </w:r>
+    </w:p>
+    <w:p>
+      <w:pPr>
+        <w:pStyle w:val="ListParagraph"/>
+        <w:numPr>
+          <w:ilvl w:val="1"/>
+          <w:numId w:val="4"/>
+        </w:numPr>
+      </w:pPr>
+      <w:r>
+        <w:t>API Endpoint: PUT /api/Identity/</w:t>
+      </w:r>
+      <w:r>
+        <w:t>user/update-profile</w:t>
+      </w:r>
+    </w:p>
+    <w:p>
+      <w:pPr>
+        <w:pStyle w:val="ListParagraph"/>
+        <w:numPr>
+          <w:ilvl w:val="1"/>
+          <w:numId w:val="4"/>
+        </w:numPr>
+      </w:pPr>
+      <w:r>
+        <w:t>Authorization: Yes</w:t>
+      </w:r>
+    </w:p>
+    <w:p>
+      <w:pPr>
+        <w:pStyle w:val="ListParagraph"/>
+        <w:numPr>
+          <w:ilvl w:val="1"/>
+          <w:numId w:val="4"/>
+        </w:numPr>
+      </w:pPr>
+      <w:r>
         <w:t xml:space="preserve">Request Payload: </w:t>
       </w:r>
     </w:p>
@@ -4004,7 +4102,31 @@
         </w:numPr>
       </w:pPr>
       <w:r>
-        <w:t>"email": "string"</w:t>
+        <w:t>"email": "string",</w:t>
+      </w:r>
+    </w:p>
+    <w:p>
+      <w:pPr>
+        <w:pStyle w:val="ListParagraph"/>
+        <w:numPr>
+          <w:ilvl w:val="2"/>
+          <w:numId w:val="4"/>
+        </w:numPr>
+      </w:pPr>
+      <w:r>
+        <w:t>"phone_number": "string",</w:t>
+      </w:r>
+    </w:p>
+    <w:p>
+      <w:pPr>
+        <w:pStyle w:val="ListParagraph"/>
+        <w:numPr>
+          <w:ilvl w:val="2"/>
+          <w:numId w:val="4"/>
+        </w:numPr>
+      </w:pPr>
+      <w:r>
+        <w:t>"day_of_birth": "2026-03-25T09:03:36.455Z"</w:t>
       </w:r>
     </w:p>
     <w:p>
@@ -4048,22 +4170,19 @@
           <w:b/>
           <w:bCs/>
         </w:rPr>
-        <w:t xml:space="preserve">Update Profile: </w:t>
-      </w:r>
-    </w:p>
-    <w:p>
-      <w:pPr>
-        <w:pStyle w:val="ListParagraph"/>
-        <w:numPr>
-          <w:ilvl w:val="1"/>
-          <w:numId w:val="4"/>
-        </w:numPr>
-      </w:pPr>
-      <w:r>
-        <w:t>API Endpoint: PUT /api/Identity/</w:t>
-      </w:r>
-      <w:r>
-        <w:t>user/update-profile</w:t>
+        <w:t xml:space="preserve">Change Password: </w:t>
+      </w:r>
+    </w:p>
+    <w:p>
+      <w:pPr>
+        <w:pStyle w:val="ListParagraph"/>
+        <w:numPr>
+          <w:ilvl w:val="1"/>
+          <w:numId w:val="4"/>
+        </w:numPr>
+      </w:pPr>
+      <w:r>
+        <w:t>API Endpoint: PUT /api/Identity/user/change-password</w:t>
       </w:r>
     </w:p>
     <w:p>
@@ -4111,6 +4230,113 @@
         </w:numPr>
       </w:pPr>
       <w:r>
+        <w:t>"old_password": "string",</w:t>
+      </w:r>
+    </w:p>
+    <w:p>
+      <w:pPr>
+        <w:pStyle w:val="ListParagraph"/>
+        <w:numPr>
+          <w:ilvl w:val="2"/>
+          <w:numId w:val="4"/>
+        </w:numPr>
+      </w:pPr>
+      <w:r>
+        <w:t>"new_password": "string"</w:t>
+      </w:r>
+    </w:p>
+    <w:p>
+      <w:pPr>
+        <w:pStyle w:val="ListParagraph"/>
+        <w:numPr>
+          <w:ilvl w:val="2"/>
+          <w:numId w:val="4"/>
+        </w:numPr>
+      </w:pPr>
+      <w:r>
+        <w:t>}</w:t>
+      </w:r>
+    </w:p>
+    <w:p>
+      <w:pPr>
+        <w:pStyle w:val="ListParagraph"/>
+        <w:numPr>
+          <w:ilvl w:val="1"/>
+          <w:numId w:val="4"/>
+        </w:numPr>
+      </w:pPr>
+      <w:r>
+        <w:t>Respond Handling: How frontent react to server’s response</w:t>
+      </w:r>
+    </w:p>
+    <w:p>
+      <w:pPr>
+        <w:pStyle w:val="ListParagraph"/>
+        <w:numPr>
+          <w:ilvl w:val="0"/>
+          <w:numId w:val="4"/>
+        </w:numPr>
+        <w:rPr>
+          <w:b/>
+          <w:bCs/>
+        </w:rPr>
+      </w:pPr>
+      <w:r>
+        <w:rPr>
+          <w:b/>
+          <w:bCs/>
+        </w:rPr>
+        <w:t xml:space="preserve">Forgot Password: </w:t>
+      </w:r>
+    </w:p>
+    <w:p>
+      <w:pPr>
+        <w:pStyle w:val="ListParagraph"/>
+        <w:numPr>
+          <w:ilvl w:val="1"/>
+          <w:numId w:val="4"/>
+        </w:numPr>
+      </w:pPr>
+      <w:r>
+        <w:t>API Endpoint: POST /api/Identity/user/forgot-password</w:t>
+      </w:r>
+      <w:r>
+        <w:tab/>
+      </w:r>
+    </w:p>
+    <w:p>
+      <w:pPr>
+        <w:pStyle w:val="ListParagraph"/>
+        <w:numPr>
+          <w:ilvl w:val="1"/>
+          <w:numId w:val="4"/>
+        </w:numPr>
+      </w:pPr>
+      <w:r>
+        <w:t xml:space="preserve">Request Payload: </w:t>
+      </w:r>
+    </w:p>
+    <w:p>
+      <w:pPr>
+        <w:pStyle w:val="ListParagraph"/>
+        <w:numPr>
+          <w:ilvl w:val="2"/>
+          <w:numId w:val="4"/>
+        </w:numPr>
+      </w:pPr>
+      <w:r>
+        <w:t>{</w:t>
+      </w:r>
+    </w:p>
+    <w:p>
+      <w:pPr>
+        <w:pStyle w:val="ListParagraph"/>
+        <w:numPr>
+          <w:ilvl w:val="2"/>
+          <w:numId w:val="4"/>
+        </w:numPr>
+      </w:pPr>
+      <w:r>
         <w:t>"email": "string",</w:t>
       </w:r>
     </w:p>
@@ -4123,19 +4349,7 @@
         </w:numPr>
       </w:pPr>
       <w:r>
-        <w:t>"phone_number": "string",</w:t>
-      </w:r>
-    </w:p>
-    <w:p>
-      <w:pPr>
-        <w:pStyle w:val="ListParagraph"/>
-        <w:numPr>
-          <w:ilvl w:val="2"/>
-          <w:numId w:val="4"/>
-        </w:numPr>
-      </w:pPr>
-      <w:r>
-        <w:t>"day_of_birth": "2026-03-25T09:03:36.455Z"</w:t>
+        <w:t>"redirectUrl": "string"</w:t>
       </w:r>
     </w:p>
     <w:p>
@@ -4179,31 +4393,19 @@
           <w:b/>
           <w:bCs/>
         </w:rPr>
-        <w:t xml:space="preserve">Change Password: </w:t>
-      </w:r>
-    </w:p>
-    <w:p>
-      <w:pPr>
-        <w:pStyle w:val="ListParagraph"/>
-        <w:numPr>
-          <w:ilvl w:val="1"/>
-          <w:numId w:val="4"/>
-        </w:numPr>
-      </w:pPr>
-      <w:r>
-        <w:t>API Endpoint: PUT /api/Identity/user/change-password</w:t>
-      </w:r>
-    </w:p>
-    <w:p>
-      <w:pPr>
-        <w:pStyle w:val="ListParagraph"/>
-        <w:numPr>
-          <w:ilvl w:val="1"/>
-          <w:numId w:val="4"/>
-        </w:numPr>
-      </w:pPr>
-      <w:r>
-        <w:t>Authorization: Yes</w:t>
+        <w:t xml:space="preserve">Reset Password: </w:t>
+      </w:r>
+    </w:p>
+    <w:p>
+      <w:pPr>
+        <w:pStyle w:val="ListParagraph"/>
+        <w:numPr>
+          <w:ilvl w:val="1"/>
+          <w:numId w:val="4"/>
+        </w:numPr>
+      </w:pPr>
+      <w:r>
+        <w:t>API Endpoint: POST /api/Identity/user/reset-password</w:t>
       </w:r>
     </w:p>
     <w:p>
@@ -4239,113 +4441,6 @@
         </w:numPr>
       </w:pPr>
       <w:r>
-        <w:t>"old_password": "string",</w:t>
-      </w:r>
-    </w:p>
-    <w:p>
-      <w:pPr>
-        <w:pStyle w:val="ListParagraph"/>
-        <w:numPr>
-          <w:ilvl w:val="2"/>
-          <w:numId w:val="4"/>
-        </w:numPr>
-      </w:pPr>
-      <w:r>
-        <w:t>"new_password": "string"</w:t>
-      </w:r>
-    </w:p>
-    <w:p>
-      <w:pPr>
-        <w:pStyle w:val="ListParagraph"/>
-        <w:numPr>
-          <w:ilvl w:val="2"/>
-          <w:numId w:val="4"/>
-        </w:numPr>
-      </w:pPr>
-      <w:r>
-        <w:t>}</w:t>
-      </w:r>
-    </w:p>
-    <w:p>
-      <w:pPr>
-        <w:pStyle w:val="ListParagraph"/>
-        <w:numPr>
-          <w:ilvl w:val="1"/>
-          <w:numId w:val="4"/>
-        </w:numPr>
-      </w:pPr>
-      <w:r>
-        <w:t>Respond Handling: How frontent react to server’s response</w:t>
-      </w:r>
-    </w:p>
-    <w:p>
-      <w:pPr>
-        <w:pStyle w:val="ListParagraph"/>
-        <w:numPr>
-          <w:ilvl w:val="0"/>
-          <w:numId w:val="4"/>
-        </w:numPr>
-        <w:rPr>
-          <w:b/>
-          <w:bCs/>
-        </w:rPr>
-      </w:pPr>
-      <w:r>
-        <w:rPr>
-          <w:b/>
-          <w:bCs/>
-        </w:rPr>
-        <w:t xml:space="preserve">Forgot Password: </w:t>
-      </w:r>
-    </w:p>
-    <w:p>
-      <w:pPr>
-        <w:pStyle w:val="ListParagraph"/>
-        <w:numPr>
-          <w:ilvl w:val="1"/>
-          <w:numId w:val="4"/>
-        </w:numPr>
-      </w:pPr>
-      <w:r>
-        <w:t>API Endpoint: POST /api/Identity/user/forgot-password</w:t>
-      </w:r>
-      <w:r>
-        <w:tab/>
-      </w:r>
-    </w:p>
-    <w:p>
-      <w:pPr>
-        <w:pStyle w:val="ListParagraph"/>
-        <w:numPr>
-          <w:ilvl w:val="1"/>
-          <w:numId w:val="4"/>
-        </w:numPr>
-      </w:pPr>
-      <w:r>
-        <w:t xml:space="preserve">Request Payload: </w:t>
-      </w:r>
-    </w:p>
-    <w:p>
-      <w:pPr>
-        <w:pStyle w:val="ListParagraph"/>
-        <w:numPr>
-          <w:ilvl w:val="2"/>
-          <w:numId w:val="4"/>
-        </w:numPr>
-      </w:pPr>
-      <w:r>
-        <w:t>{</w:t>
-      </w:r>
-    </w:p>
-    <w:p>
-      <w:pPr>
-        <w:pStyle w:val="ListParagraph"/>
-        <w:numPr>
-          <w:ilvl w:val="2"/>
-          <w:numId w:val="4"/>
-        </w:numPr>
-      </w:pPr>
-      <w:r>
         <w:t>"email": "string",</w:t>
       </w:r>
     </w:p>
@@ -4358,110 +4453,6 @@
         </w:numPr>
       </w:pPr>
       <w:r>
-        <w:t>"redirectUrl": "string"</w:t>
-      </w:r>
-    </w:p>
-    <w:p>
-      <w:pPr>
-        <w:pStyle w:val="ListParagraph"/>
-        <w:numPr>
-          <w:ilvl w:val="2"/>
-          <w:numId w:val="4"/>
-        </w:numPr>
-      </w:pPr>
-      <w:r>
-        <w:t>}</w:t>
-      </w:r>
-    </w:p>
-    <w:p>
-      <w:pPr>
-        <w:pStyle w:val="ListParagraph"/>
-        <w:numPr>
-          <w:ilvl w:val="1"/>
-          <w:numId w:val="4"/>
-        </w:numPr>
-      </w:pPr>
-      <w:r>
-        <w:t>Respond Handling: How frontent react to server’s response</w:t>
-      </w:r>
-    </w:p>
-    <w:p>
-      <w:pPr>
-        <w:pStyle w:val="ListParagraph"/>
-        <w:numPr>
-          <w:ilvl w:val="0"/>
-          <w:numId w:val="4"/>
-        </w:numPr>
-        <w:rPr>
-          <w:b/>
-          <w:bCs/>
-        </w:rPr>
-      </w:pPr>
-      <w:r>
-        <w:rPr>
-          <w:b/>
-          <w:bCs/>
-        </w:rPr>
-        <w:t xml:space="preserve">Reset Password: </w:t>
-      </w:r>
-    </w:p>
-    <w:p>
-      <w:pPr>
-        <w:pStyle w:val="ListParagraph"/>
-        <w:numPr>
-          <w:ilvl w:val="1"/>
-          <w:numId w:val="4"/>
-        </w:numPr>
-      </w:pPr>
-      <w:r>
-        <w:t>API Endpoint: POST /api/Identity/user/reset-password</w:t>
-      </w:r>
-    </w:p>
-    <w:p>
-      <w:pPr>
-        <w:pStyle w:val="ListParagraph"/>
-        <w:numPr>
-          <w:ilvl w:val="1"/>
-          <w:numId w:val="4"/>
-        </w:numPr>
-      </w:pPr>
-      <w:r>
-        <w:t xml:space="preserve">Request Payload: </w:t>
-      </w:r>
-    </w:p>
-    <w:p>
-      <w:pPr>
-        <w:pStyle w:val="ListParagraph"/>
-        <w:numPr>
-          <w:ilvl w:val="2"/>
-          <w:numId w:val="4"/>
-        </w:numPr>
-      </w:pPr>
-      <w:r>
-        <w:t>{</w:t>
-      </w:r>
-    </w:p>
-    <w:p>
-      <w:pPr>
-        <w:pStyle w:val="ListParagraph"/>
-        <w:numPr>
-          <w:ilvl w:val="2"/>
-          <w:numId w:val="4"/>
-        </w:numPr>
-      </w:pPr>
-      <w:r>
-        <w:t>"email": "string",</w:t>
-      </w:r>
-    </w:p>
-    <w:p>
-      <w:pPr>
-        <w:pStyle w:val="ListParagraph"/>
-        <w:numPr>
-          <w:ilvl w:val="2"/>
-          <w:numId w:val="4"/>
-        </w:numPr>
-      </w:pPr>
-      <w:r>
         <w:t>"password": "string",</w:t>
       </w:r>
     </w:p>
@@ -4474,19 +4465,19 @@
         </w:numPr>
       </w:pPr>
       <w:r>
+        <w:t>"confirm_password": "string",</w:t>
+      </w:r>
+    </w:p>
+    <w:p>
+      <w:pPr>
+        <w:pStyle w:val="ListParagraph"/>
+        <w:numPr>
+          <w:ilvl w:val="2"/>
+          <w:numId w:val="4"/>
+        </w:numPr>
+      </w:pPr>
+      <w:r>
         <w:lastRenderedPageBreak/>
-        <w:t>"confirm_password": "string",</w:t>
-      </w:r>
-    </w:p>
-    <w:p>
-      <w:pPr>
-        <w:pStyle w:val="ListParagraph"/>
-        <w:numPr>
-          <w:ilvl w:val="2"/>
-          <w:numId w:val="4"/>
-        </w:numPr>
-      </w:pPr>
-      <w:r>
         <w:t>"token": "string"</w:t>
       </w:r>
     </w:p>
@@ -4742,6 +4733,42 @@
           <w:u w:val="single"/>
         </w:rPr>
         <w:t>Retrospective &amp; Refactor Notes</w:t>
+      </w:r>
+    </w:p>
+    <w:p>
+      <w:pPr>
+        <w:pStyle w:val="ListParagraph"/>
+        <w:numPr>
+          <w:ilvl w:val="0"/>
+          <w:numId w:val="4"/>
+        </w:numPr>
+      </w:pPr>
+      <w:r>
+        <w:t>Bottlenecks: Is there a slow database query or a UI component that renders too many times?</w:t>
+      </w:r>
+    </w:p>
+    <w:p>
+      <w:pPr>
+        <w:pStyle w:val="ListParagraph"/>
+        <w:numPr>
+          <w:ilvl w:val="0"/>
+          <w:numId w:val="4"/>
+        </w:numPr>
+      </w:pPr>
+      <w:r>
+        <w:t>Code Smells: Is the logic entirely stuffed into the controller instead of being seperated into services? Are there hardcoded strings?</w:t>
+      </w:r>
+    </w:p>
+    <w:p>
+      <w:pPr>
+        <w:pStyle w:val="ListParagraph"/>
+        <w:numPr>
+          <w:ilvl w:val="0"/>
+          <w:numId w:val="4"/>
+        </w:numPr>
+      </w:pPr>
+      <w:r>
+        <w:t>Modernization: How would you write this feature differently today with your current skills?</w:t>
       </w:r>
     </w:p>
     <w:sectPr>
@@ -5494,6 +5521,119 @@
     </w:lvl>
   </w:abstractNum>
   <w:abstractNum w:abstractNumId="7" w15:restartNumberingAfterBreak="0">
+    <w:nsid w:val="6E7D72AC"/>
+    <w:multiLevelType w:val="hybridMultilevel"/>
+    <w:tmpl w:val="1AE4F656"/>
+    <w:lvl w:ilvl="0" w:tplc="04090001">
+      <w:start w:val="1"/>
+      <w:numFmt w:val="bullet"/>
+      <w:lvlText w:val=""/>
+      <w:lvlJc w:val="left"/>
+      <w:pPr>
+        <w:ind w:left="1440" w:hanging="360"/>
+      </w:pPr>
+      <w:rPr>
+        <w:rFonts w:ascii="Symbol" w:hAnsi="Symbol" w:hint="default"/>
+      </w:rPr>
+    </w:lvl>
+    <w:lvl w:ilvl="1" w:tplc="04090003" w:tentative="1">
+      <w:start w:val="1"/>
+      <w:numFmt w:val="bullet"/>
+      <w:lvlText w:val="o"/>
+      <w:lvlJc w:val="left"/>
+      <w:pPr>
+        <w:ind w:left="2160" w:hanging="360"/>
+      </w:pPr>
+      <w:rPr>
+        <w:rFonts w:ascii="Courier New" w:hAnsi="Courier New" w:cs="Courier New" w:hint="default"/>
+      </w:rPr>
+    </w:lvl>
+    <w:lvl w:ilvl="2" w:tplc="04090005" w:tentative="1">
+      <w:start w:val="1"/>
+      <w:numFmt w:val="bullet"/>
+      <w:lvlText w:val=""/>
+      <w:lvlJc w:val="left"/>
+      <w:pPr>
+        <w:ind w:left="2880" w:hanging="360"/>
+      </w:pPr>
+      <w:rPr>
+        <w:rFonts w:ascii="Wingdings" w:hAnsi="Wingdings" w:hint="default"/>
+      </w:rPr>
+    </w:lvl>
+    <w:lvl w:ilvl="3" w:tplc="04090001" w:tentative="1">
+      <w:start w:val="1"/>
+      <w:numFmt w:val="bullet"/>
+      <w:lvlText w:val=""/>
+      <w:lvlJc w:val="left"/>
+      <w:pPr>
+        <w:ind w:left="3600" w:hanging="360"/>
+      </w:pPr>
+      <w:rPr>
+        <w:rFonts w:ascii="Symbol" w:hAnsi="Symbol" w:hint="default"/>
+      </w:rPr>
+    </w:lvl>
+    <w:lvl w:ilvl="4" w:tplc="04090003" w:tentative="1">
+      <w:start w:val="1"/>
+      <w:numFmt w:val="bullet"/>
+      <w:lvlText w:val="o"/>
+      <w:lvlJc w:val="left"/>
+      <w:pPr>
+        <w:ind w:left="4320" w:hanging="360"/>
+      </w:pPr>
+      <w:rPr>
+        <w:rFonts w:ascii="Courier New" w:hAnsi="Courier New" w:cs="Courier New" w:hint="default"/>
+      </w:rPr>
+    </w:lvl>
+    <w:lvl w:ilvl="5" w:tplc="04090005" w:tentative="1">
+      <w:start w:val="1"/>
+      <w:numFmt w:val="bullet"/>
+      <w:lvlText w:val=""/>
+      <w:lvlJc w:val="left"/>
+      <w:pPr>
+        <w:ind w:left="5040" w:hanging="360"/>
+      </w:pPr>
+      <w:rPr>
+        <w:rFonts w:ascii="Wingdings" w:hAnsi="Wingdings" w:hint="default"/>
+      </w:rPr>
+    </w:lvl>
+    <w:lvl w:ilvl="6" w:tplc="04090001" w:tentative="1">
+      <w:start w:val="1"/>
+      <w:numFmt w:val="bullet"/>
+      <w:lvlText w:val=""/>
+      <w:lvlJc w:val="left"/>
+      <w:pPr>
+        <w:ind w:left="5760" w:hanging="360"/>
+      </w:pPr>
+      <w:rPr>
+        <w:rFonts w:ascii="Symbol" w:hAnsi="Symbol" w:hint="default"/>
+      </w:rPr>
+    </w:lvl>
+    <w:lvl w:ilvl="7" w:tplc="04090003" w:tentative="1">
+      <w:start w:val="1"/>
+      <w:numFmt w:val="bullet"/>
+      <w:lvlText w:val="o"/>
+      <w:lvlJc w:val="left"/>
+      <w:pPr>
+        <w:ind w:left="6480" w:hanging="360"/>
+      </w:pPr>
+      <w:rPr>
+        <w:rFonts w:ascii="Courier New" w:hAnsi="Courier New" w:cs="Courier New" w:hint="default"/>
+      </w:rPr>
+    </w:lvl>
+    <w:lvl w:ilvl="8" w:tplc="04090005" w:tentative="1">
+      <w:start w:val="1"/>
+      <w:numFmt w:val="bullet"/>
+      <w:lvlText w:val=""/>
+      <w:lvlJc w:val="left"/>
+      <w:pPr>
+        <w:ind w:left="7200" w:hanging="360"/>
+      </w:pPr>
+      <w:rPr>
+        <w:rFonts w:ascii="Wingdings" w:hAnsi="Wingdings" w:hint="default"/>
+      </w:rPr>
+    </w:lvl>
+  </w:abstractNum>
+  <w:abstractNum w:abstractNumId="8" w15:restartNumberingAfterBreak="0">
     <w:nsid w:val="70FD66F5"/>
     <w:multiLevelType w:val="hybridMultilevel"/>
     <w:tmpl w:val="44B2D0E6"/>
@@ -5534,6 +5674,119 @@
       </w:rPr>
     </w:lvl>
     <w:lvl w:ilvl="3" w:tplc="04090001">
+      <w:start w:val="1"/>
+      <w:numFmt w:val="bullet"/>
+      <w:lvlText w:val=""/>
+      <w:lvlJc w:val="left"/>
+      <w:pPr>
+        <w:ind w:left="2880" w:hanging="360"/>
+      </w:pPr>
+      <w:rPr>
+        <w:rFonts w:ascii="Symbol" w:hAnsi="Symbol" w:hint="default"/>
+      </w:rPr>
+    </w:lvl>
+    <w:lvl w:ilvl="4" w:tplc="04090003" w:tentative="1">
+      <w:start w:val="1"/>
+      <w:numFmt w:val="bullet"/>
+      <w:lvlText w:val="o"/>
+      <w:lvlJc w:val="left"/>
+      <w:pPr>
+        <w:ind w:left="3600" w:hanging="360"/>
+      </w:pPr>
+      <w:rPr>
+        <w:rFonts w:ascii="Courier New" w:hAnsi="Courier New" w:cs="Courier New" w:hint="default"/>
+      </w:rPr>
+    </w:lvl>
+    <w:lvl w:ilvl="5" w:tplc="04090005" w:tentative="1">
+      <w:start w:val="1"/>
+      <w:numFmt w:val="bullet"/>
+      <w:lvlText w:val=""/>
+      <w:lvlJc w:val="left"/>
+      <w:pPr>
+        <w:ind w:left="4320" w:hanging="360"/>
+      </w:pPr>
+      <w:rPr>
+        <w:rFonts w:ascii="Wingdings" w:hAnsi="Wingdings" w:hint="default"/>
+      </w:rPr>
+    </w:lvl>
+    <w:lvl w:ilvl="6" w:tplc="04090001" w:tentative="1">
+      <w:start w:val="1"/>
+      <w:numFmt w:val="bullet"/>
+      <w:lvlText w:val=""/>
+      <w:lvlJc w:val="left"/>
+      <w:pPr>
+        <w:ind w:left="5040" w:hanging="360"/>
+      </w:pPr>
+      <w:rPr>
+        <w:rFonts w:ascii="Symbol" w:hAnsi="Symbol" w:hint="default"/>
+      </w:rPr>
+    </w:lvl>
+    <w:lvl w:ilvl="7" w:tplc="04090003" w:tentative="1">
+      <w:start w:val="1"/>
+      <w:numFmt w:val="bullet"/>
+      <w:lvlText w:val="o"/>
+      <w:lvlJc w:val="left"/>
+      <w:pPr>
+        <w:ind w:left="5760" w:hanging="360"/>
+      </w:pPr>
+      <w:rPr>
+        <w:rFonts w:ascii="Courier New" w:hAnsi="Courier New" w:cs="Courier New" w:hint="default"/>
+      </w:rPr>
+    </w:lvl>
+    <w:lvl w:ilvl="8" w:tplc="04090005" w:tentative="1">
+      <w:start w:val="1"/>
+      <w:numFmt w:val="bullet"/>
+      <w:lvlText w:val=""/>
+      <w:lvlJc w:val="left"/>
+      <w:pPr>
+        <w:ind w:left="6480" w:hanging="360"/>
+      </w:pPr>
+      <w:rPr>
+        <w:rFonts w:ascii="Wingdings" w:hAnsi="Wingdings" w:hint="default"/>
+      </w:rPr>
+    </w:lvl>
+  </w:abstractNum>
+  <w:abstractNum w:abstractNumId="9" w15:restartNumberingAfterBreak="0">
+    <w:nsid w:val="7EF671BD"/>
+    <w:multiLevelType w:val="hybridMultilevel"/>
+    <w:tmpl w:val="5346F754"/>
+    <w:lvl w:ilvl="0" w:tplc="04090001">
+      <w:start w:val="1"/>
+      <w:numFmt w:val="bullet"/>
+      <w:lvlText w:val=""/>
+      <w:lvlJc w:val="left"/>
+      <w:pPr>
+        <w:ind w:left="720" w:hanging="360"/>
+      </w:pPr>
+      <w:rPr>
+        <w:rFonts w:ascii="Symbol" w:hAnsi="Symbol" w:hint="default"/>
+      </w:rPr>
+    </w:lvl>
+    <w:lvl w:ilvl="1" w:tplc="04090003" w:tentative="1">
+      <w:start w:val="1"/>
+      <w:numFmt w:val="bullet"/>
+      <w:lvlText w:val="o"/>
+      <w:lvlJc w:val="left"/>
+      <w:pPr>
+        <w:ind w:left="1440" w:hanging="360"/>
+      </w:pPr>
+      <w:rPr>
+        <w:rFonts w:ascii="Courier New" w:hAnsi="Courier New" w:cs="Courier New" w:hint="default"/>
+      </w:rPr>
+    </w:lvl>
+    <w:lvl w:ilvl="2" w:tplc="04090005" w:tentative="1">
+      <w:start w:val="1"/>
+      <w:numFmt w:val="bullet"/>
+      <w:lvlText w:val=""/>
+      <w:lvlJc w:val="left"/>
+      <w:pPr>
+        <w:ind w:left="2160" w:hanging="360"/>
+      </w:pPr>
+      <w:rPr>
+        <w:rFonts w:ascii="Wingdings" w:hAnsi="Wingdings" w:hint="default"/>
+      </w:rPr>
+    </w:lvl>
+    <w:lvl w:ilvl="3" w:tplc="04090001" w:tentative="1">
       <w:start w:val="1"/>
       <w:numFmt w:val="bullet"/>
       <w:lvlText w:val=""/>
@@ -5613,7 +5866,7 @@
     <w:abstractNumId w:val="0"/>
   </w:num>
   <w:num w:numId="3" w16cid:durableId="1991208130">
-    <w:abstractNumId w:val="7"/>
+    <w:abstractNumId w:val="8"/>
   </w:num>
   <w:num w:numId="4" w16cid:durableId="665939140">
     <w:abstractNumId w:val="6"/>
@@ -5629,6 +5882,12 @@
   </w:num>
   <w:num w:numId="8" w16cid:durableId="369916516">
     <w:abstractNumId w:val="2"/>
+  </w:num>
+  <w:num w:numId="9" w16cid:durableId="464087553">
+    <w:abstractNumId w:val="7"/>
+  </w:num>
+  <w:num w:numId="10" w16cid:durableId="748580417">
+    <w:abstractNumId w:val="9"/>
   </w:num>
 </w:numbering>
 </file>
@@ -6237,6 +6496,7 @@
   <w:style w:type="character" w:default="1" w:styleId="DefaultParagraphFont">
     <w:name w:val="Default Paragraph Font"/>
     <w:uiPriority w:val="1"/>
+    <w:semiHidden/>
     <w:unhideWhenUsed/>
   </w:style>
   <w:style w:type="table" w:default="1" w:styleId="TableNormal">

</xml_diff>

<commit_message>
feat(auth): Improve logout and token revocation flow
CHANGES:
- Update identity controller login/logout behavior and add logout flow notes.
- Extend token/user repository abstractions and implementations for token lifecycle operations.
- Adjust token and user services plus shared responses to support the updated auth flow.
- Update authentication project dependencies/config and refresh identity feature documentation.

IMPACT:
- Improves consistency of auth token handling during logout and related identity actions.
- Introduces contract updates in repository/service abstractions that downstream callers must align with.
- Includes documentation and backend behavior updates tied to OTP/logout workflows.

TEST:
- Not run locally in this step.
</commit_message>
<xml_diff>
--- a/Project-Analysis/Features/Identity.docx
+++ b/Project-Analysis/Features/Identity.docx
@@ -1911,43 +1911,130 @@
         </w:numPr>
       </w:pPr>
       <w:r>
-        <w:t>API Endpoint: POST /api/Identity/user/logout</w:t>
-      </w:r>
-    </w:p>
-    <w:p>
-      <w:pPr>
-        <w:pStyle w:val="ListParagraph"/>
-        <w:numPr>
-          <w:ilvl w:val="1"/>
-          <w:numId w:val="7"/>
-        </w:numPr>
-      </w:pPr>
-      <w:r>
-        <w:t>Authorization: yes</w:t>
-      </w:r>
-    </w:p>
-    <w:p>
-      <w:pPr>
-        <w:pStyle w:val="ListParagraph"/>
-        <w:numPr>
-          <w:ilvl w:val="1"/>
-          <w:numId w:val="7"/>
-        </w:numPr>
-      </w:pPr>
-      <w:r>
-        <w:t>Request Payload: NULL</w:t>
-      </w:r>
-    </w:p>
-    <w:p>
-      <w:pPr>
-        <w:pStyle w:val="ListParagraph"/>
-        <w:numPr>
-          <w:ilvl w:val="1"/>
-          <w:numId w:val="7"/>
-        </w:numPr>
-      </w:pPr>
-      <w:r>
-        <w:t>Respond Handling: How frontent react to server’s response</w:t>
+        <w:t>Controller/Router: The request hits “IdentityController.cs” at the HttpPost(“/api/Identity/user/</w:t>
+      </w:r>
+      <w:r>
+        <w:t>logout</w:t>
+      </w:r>
+      <w:r>
+        <w:t>”) endpoint</w:t>
+      </w:r>
+    </w:p>
+    <w:p>
+      <w:pPr>
+        <w:pStyle w:val="ListParagraph"/>
+        <w:numPr>
+          <w:ilvl w:val="1"/>
+          <w:numId w:val="7"/>
+        </w:numPr>
+      </w:pPr>
+      <w:r>
+        <w:t>Services/Handlers:</w:t>
+      </w:r>
+    </w:p>
+    <w:p>
+      <w:pPr>
+        <w:pStyle w:val="ListParagraph"/>
+        <w:numPr>
+          <w:ilvl w:val="2"/>
+          <w:numId w:val="7"/>
+        </w:numPr>
+      </w:pPr>
+      <w:r>
+        <w:t>The user id and email will be extracted from User Access Token</w:t>
+      </w:r>
+    </w:p>
+    <w:p>
+      <w:pPr>
+        <w:pStyle w:val="ListParagraph"/>
+        <w:numPr>
+          <w:ilvl w:val="2"/>
+          <w:numId w:val="7"/>
+        </w:numPr>
+      </w:pPr>
+      <w:r>
+        <w:t>If the userId is null or empty, return “400 Bad Request” error immediately</w:t>
+      </w:r>
+    </w:p>
+    <w:p>
+      <w:pPr>
+        <w:pStyle w:val="ListParagraph"/>
+        <w:numPr>
+          <w:ilvl w:val="2"/>
+          <w:numId w:val="7"/>
+        </w:numPr>
+      </w:pPr>
+      <w:r>
+        <w:t>Then, we use UserService object to call “GetUserByIdAsync” to get the user by his/her id.</w:t>
+      </w:r>
+    </w:p>
+    <w:p>
+      <w:pPr>
+        <w:pStyle w:val="ListParagraph"/>
+        <w:numPr>
+          <w:ilvl w:val="2"/>
+          <w:numId w:val="7"/>
+        </w:numPr>
+      </w:pPr>
+      <w:r>
+        <w:t>If the returned user is null, return “404 Not Found” error</w:t>
+      </w:r>
+    </w:p>
+    <w:p>
+      <w:pPr>
+        <w:pStyle w:val="ListParagraph"/>
+        <w:numPr>
+          <w:ilvl w:val="2"/>
+          <w:numId w:val="7"/>
+        </w:numPr>
+      </w:pPr>
+      <w:r>
+        <w:t>Next, we extract access token from “Authorization” header of the requst, then compare it with in database access token we fetch with the user earlier. If match go into the next line; If not match, return “400 Bad Request” response</w:t>
+      </w:r>
+    </w:p>
+    <w:p>
+      <w:pPr>
+        <w:pStyle w:val="ListParagraph"/>
+        <w:numPr>
+          <w:ilvl w:val="2"/>
+          <w:numId w:val="7"/>
+        </w:numPr>
+      </w:pPr>
+      <w:r>
+        <w:t>Then, we will invalidate the access token and refresh token both from the database and the client’s cookie before returning “200 Ok” Request that indicates the user has been logged out successfully.</w:t>
+      </w:r>
+    </w:p>
+    <w:p>
+      <w:pPr>
+        <w:pStyle w:val="ListParagraph"/>
+        <w:numPr>
+          <w:ilvl w:val="2"/>
+          <w:numId w:val="7"/>
+        </w:numPr>
+      </w:pPr>
+      <w:r>
+        <w:t>From now on, both the access token and refresh token cannot be used anymore</w:t>
+      </w:r>
+    </w:p>
+    <w:p>
+      <w:pPr>
+        <w:pStyle w:val="ListParagraph"/>
+        <w:numPr>
+          <w:ilvl w:val="1"/>
+          <w:numId w:val="7"/>
+        </w:numPr>
+      </w:pPr>
+      <w:r>
+        <w:t xml:space="preserve">Authorization: </w:t>
+      </w:r>
+      <w:r>
+        <w:t xml:space="preserve">Only </w:t>
+      </w:r>
+      <w:r>
+        <w:t>“Authorized”</w:t>
+      </w:r>
+      <w:r>
+        <w:t xml:space="preserve"> users are permitted to access the endpoint</w:t>
       </w:r>
     </w:p>
     <w:p>
@@ -2021,6 +2108,7 @@
         </w:numPr>
       </w:pPr>
       <w:r>
+        <w:lastRenderedPageBreak/>
         <w:t>Services/Handlers:</w:t>
       </w:r>
     </w:p>
@@ -2108,112 +2196,208 @@
         </w:numPr>
       </w:pPr>
       <w:r>
+        <w:t>Authorization: The endpoint is annotated as [AllowAnonymous] which means that it does not need the access token to call to it</w:t>
+      </w:r>
+    </w:p>
+    <w:p>
+      <w:pPr>
+        <w:pStyle w:val="ListParagraph"/>
+        <w:numPr>
+          <w:ilvl w:val="0"/>
+          <w:numId w:val="7"/>
+        </w:numPr>
+        <w:rPr>
+          <w:b/>
+          <w:bCs/>
+        </w:rPr>
+      </w:pPr>
+      <w:r>
+        <w:rPr>
+          <w:b/>
+          <w:bCs/>
+        </w:rPr>
+        <w:t xml:space="preserve">OTP Login: </w:t>
+      </w:r>
+    </w:p>
+    <w:p>
+      <w:pPr>
+        <w:pStyle w:val="ListParagraph"/>
+        <w:numPr>
+          <w:ilvl w:val="1"/>
+          <w:numId w:val="7"/>
+        </w:numPr>
+      </w:pPr>
+      <w:r>
+        <w:t>Controller/Router: The request hits “IdentityController.cs” at the HttpPost(“/api/Identity/user/</w:t>
+      </w:r>
+      <w:r>
+        <w:t>otp-login</w:t>
+      </w:r>
+      <w:r>
+        <w:t>”) endpoint</w:t>
+      </w:r>
+    </w:p>
+    <w:p>
+      <w:pPr>
+        <w:pStyle w:val="ListParagraph"/>
+        <w:numPr>
+          <w:ilvl w:val="2"/>
+          <w:numId w:val="7"/>
+        </w:numPr>
+      </w:pPr>
+      <w:r>
+        <w:t>It accepts a “</w:t>
+      </w:r>
+      <w:r>
+        <w:t>OTPLoginRequest</w:t>
+      </w:r>
+      <w:r>
+        <w:t>” object containing a login credentials.</w:t>
+      </w:r>
+    </w:p>
+    <w:p>
+      <w:pPr>
+        <w:pStyle w:val="ListParagraph"/>
+        <w:numPr>
+          <w:ilvl w:val="1"/>
+          <w:numId w:val="7"/>
+        </w:numPr>
+      </w:pPr>
+      <w:r>
+        <w:t>Services/Handlers:</w:t>
+      </w:r>
+    </w:p>
+    <w:p>
+      <w:pPr>
+        <w:pStyle w:val="ListParagraph"/>
+        <w:numPr>
+          <w:ilvl w:val="2"/>
+          <w:numId w:val="7"/>
+        </w:numPr>
+      </w:pPr>
+      <w:r>
+        <w:t>It passes a request Email and request OTP into “ValidateOTPAsync” method of “ITokenService” interface to validating the OTP from the request</w:t>
+      </w:r>
+    </w:p>
+    <w:p>
+      <w:pPr>
+        <w:pStyle w:val="ListParagraph"/>
+        <w:numPr>
+          <w:ilvl w:val="2"/>
+          <w:numId w:val="7"/>
+        </w:numPr>
+      </w:pPr>
+      <w:r>
+        <w:t>Next, the token service object calls “FindByEmailAsync” method of “IUserRepository” interface to get the user based on his/her email address.</w:t>
+      </w:r>
+    </w:p>
+    <w:p>
+      <w:pPr>
+        <w:pStyle w:val="ListParagraph"/>
+        <w:numPr>
+          <w:ilvl w:val="2"/>
+          <w:numId w:val="7"/>
+        </w:numPr>
+      </w:pPr>
+      <w:r>
+        <w:t>If the user is null or the token is invalid, returns an error result, which then results in “401 Unauthorized” respond. If it is valid, return the user that was fetched from database</w:t>
+      </w:r>
+    </w:p>
+    <w:p>
+      <w:pPr>
+        <w:pStyle w:val="ListParagraph"/>
+        <w:numPr>
+          <w:ilvl w:val="2"/>
+          <w:numId w:val="7"/>
+        </w:numPr>
+      </w:pPr>
+      <w:r>
+        <w:t>Next, the access token and refresh token will be generated</w:t>
+      </w:r>
+      <w:r>
+        <w:t xml:space="preserve"> and persist into database:</w:t>
+      </w:r>
+    </w:p>
+    <w:p>
+      <w:pPr>
+        <w:pStyle w:val="ListParagraph"/>
+        <w:numPr>
+          <w:ilvl w:val="3"/>
+          <w:numId w:val="7"/>
+        </w:numPr>
+      </w:pPr>
+      <w:r>
+        <w:t xml:space="preserve">The access token is formed by using a Symmetric “JsonWebKey”, user claims like </w:t>
+      </w:r>
+      <w:r>
+        <w:t xml:space="preserve">“Name”, “NameIdentifier”, “Email”, “permission” and “role”, issuer and audience. </w:t>
+      </w:r>
+    </w:p>
+    <w:p>
+      <w:pPr>
+        <w:pStyle w:val="ListParagraph"/>
+        <w:numPr>
+          <w:ilvl w:val="3"/>
+          <w:numId w:val="7"/>
+        </w:numPr>
+      </w:pPr>
+      <w:r>
+        <w:t>The refresh token is a 32 characters long string that contain</w:t>
+      </w:r>
+      <w:r>
+        <w:t xml:space="preserve"> only aphanumerics and underscore, hyphen.</w:t>
+      </w:r>
+    </w:p>
+    <w:p>
+      <w:pPr>
+        <w:pStyle w:val="ListParagraph"/>
+        <w:numPr>
+          <w:ilvl w:val="2"/>
+          <w:numId w:val="7"/>
+        </w:numPr>
+      </w:pPr>
+      <w:r>
         <w:lastRenderedPageBreak/>
+        <w:t>Then, we call the Token Repository object method “SaveChangesAsync” to persist the tokens into database and return the tokens to “IdentityController”</w:t>
+      </w:r>
+    </w:p>
+    <w:p>
+      <w:pPr>
+        <w:pStyle w:val="ListParagraph"/>
+        <w:numPr>
+          <w:ilvl w:val="2"/>
+          <w:numId w:val="7"/>
+        </w:numPr>
+      </w:pPr>
+      <w:r>
+        <w:t>We create two records into the client’s cookie, which are: “access_token” for Access Token and “refresh_token” for Refresh Token</w:t>
+      </w:r>
+    </w:p>
+    <w:p>
+      <w:pPr>
+        <w:pStyle w:val="ListParagraph"/>
+        <w:numPr>
+          <w:ilvl w:val="2"/>
+          <w:numId w:val="7"/>
+        </w:numPr>
+      </w:pPr>
+      <w:r>
+        <w:t xml:space="preserve">Finally, we return an “200 Ok” Response to user with </w:t>
+      </w:r>
+      <w:r>
+        <w:t>the tokens and his/her user’s information in it</w:t>
+      </w:r>
+    </w:p>
+    <w:p>
+      <w:pPr>
+        <w:pStyle w:val="ListParagraph"/>
+        <w:numPr>
+          <w:ilvl w:val="1"/>
+          <w:numId w:val="7"/>
+        </w:numPr>
+      </w:pPr>
+      <w:r>
         <w:t>Authorization: The endpoint is annotated as [AllowAnonymous] which means that it does not need the access token to call to it</w:t>
-      </w:r>
-    </w:p>
-    <w:p>
-      <w:pPr>
-        <w:pStyle w:val="ListParagraph"/>
-        <w:numPr>
-          <w:ilvl w:val="0"/>
-          <w:numId w:val="7"/>
-        </w:numPr>
-        <w:rPr>
-          <w:b/>
-          <w:bCs/>
-        </w:rPr>
-      </w:pPr>
-      <w:r>
-        <w:rPr>
-          <w:b/>
-          <w:bCs/>
-        </w:rPr>
-        <w:t xml:space="preserve">OTP Login: </w:t>
-      </w:r>
-    </w:p>
-    <w:p>
-      <w:pPr>
-        <w:pStyle w:val="ListParagraph"/>
-        <w:numPr>
-          <w:ilvl w:val="1"/>
-          <w:numId w:val="7"/>
-        </w:numPr>
-      </w:pPr>
-      <w:r>
-        <w:t>API Endpoint: POST /api/Identity/user/otp-login</w:t>
-      </w:r>
-    </w:p>
-    <w:p>
-      <w:pPr>
-        <w:pStyle w:val="ListParagraph"/>
-        <w:numPr>
-          <w:ilvl w:val="1"/>
-          <w:numId w:val="7"/>
-        </w:numPr>
-      </w:pPr>
-      <w:r>
-        <w:t>Request Payload:</w:t>
-      </w:r>
-    </w:p>
-    <w:p>
-      <w:pPr>
-        <w:pStyle w:val="ListParagraph"/>
-        <w:numPr>
-          <w:ilvl w:val="2"/>
-          <w:numId w:val="7"/>
-        </w:numPr>
-      </w:pPr>
-      <w:r>
-        <w:t>{</w:t>
-      </w:r>
-    </w:p>
-    <w:p>
-      <w:pPr>
-        <w:pStyle w:val="ListParagraph"/>
-        <w:numPr>
-          <w:ilvl w:val="2"/>
-          <w:numId w:val="7"/>
-        </w:numPr>
-      </w:pPr>
-      <w:r>
-        <w:t>"email": "string",</w:t>
-      </w:r>
-    </w:p>
-    <w:p>
-      <w:pPr>
-        <w:pStyle w:val="ListParagraph"/>
-        <w:numPr>
-          <w:ilvl w:val="2"/>
-          <w:numId w:val="7"/>
-        </w:numPr>
-      </w:pPr>
-      <w:r>
-        <w:t>"otp": "string"</w:t>
-      </w:r>
-    </w:p>
-    <w:p>
-      <w:pPr>
-        <w:pStyle w:val="ListParagraph"/>
-        <w:numPr>
-          <w:ilvl w:val="2"/>
-          <w:numId w:val="7"/>
-        </w:numPr>
-      </w:pPr>
-      <w:r>
-        <w:t>}</w:t>
-      </w:r>
-    </w:p>
-    <w:p>
-      <w:pPr>
-        <w:pStyle w:val="ListParagraph"/>
-        <w:numPr>
-          <w:ilvl w:val="1"/>
-          <w:numId w:val="7"/>
-        </w:numPr>
-      </w:pPr>
-      <w:r>
-        <w:t>Respond Handling:</w:t>
       </w:r>
     </w:p>
     <w:p>
@@ -3221,6 +3405,125 @@
         </w:numPr>
       </w:pPr>
       <w:r>
+        <w:t xml:space="preserve">Query 1: </w:t>
+      </w:r>
+      <w:r>
+        <w:t xml:space="preserve">a </w:t>
+      </w:r>
+      <w:r>
+        <w:t xml:space="preserve">“SELECT” </w:t>
+      </w:r>
+      <w:r>
+        <w:t>query to [Identity].[AspNetUsers] table to get the user with the specific Id</w:t>
+      </w:r>
+    </w:p>
+    <w:p>
+      <w:pPr>
+        <w:pStyle w:val="ListParagraph"/>
+        <w:numPr>
+          <w:ilvl w:val="2"/>
+          <w:numId w:val="5"/>
+        </w:numPr>
+      </w:pPr>
+      <w:r>
+        <w:t>Query 2: An “</w:t>
+      </w:r>
+      <w:r>
+        <w:t>SELECT</w:t>
+      </w:r>
+      <w:r>
+        <w:t xml:space="preserve">” </w:t>
+      </w:r>
+      <w:r>
+        <w:t>query to the join of [Identity].[AspNetUsers].[Id] and table [Identity].[AspNetUserTokens] based on the user id to get the specific’s user tokens</w:t>
+      </w:r>
+    </w:p>
+    <w:p>
+      <w:pPr>
+        <w:pStyle w:val="ListParagraph"/>
+        <w:numPr>
+          <w:ilvl w:val="2"/>
+          <w:numId w:val="5"/>
+        </w:numPr>
+      </w:pPr>
+      <w:r>
+        <w:t>Query 3</w:t>
+      </w:r>
+      <w:r>
+        <w:t>: Two “DELETE” commands to database to delete access token and refresh token in [Identity].[AspNetUserTokens] table</w:t>
+      </w:r>
+    </w:p>
+    <w:p>
+      <w:pPr>
+        <w:pStyle w:val="ListParagraph"/>
+        <w:numPr>
+          <w:ilvl w:val="1"/>
+          <w:numId w:val="4"/>
+        </w:numPr>
+      </w:pPr>
+      <w:r>
+        <w:t>External Services</w:t>
+      </w:r>
+      <w:r>
+        <w:t>:</w:t>
+      </w:r>
+      <w:r>
+        <w:t xml:space="preserve"> No</w:t>
+      </w:r>
+    </w:p>
+    <w:p>
+      <w:pPr>
+        <w:pStyle w:val="ListParagraph"/>
+        <w:numPr>
+          <w:ilvl w:val="0"/>
+          <w:numId w:val="4"/>
+        </w:numPr>
+        <w:rPr>
+          <w:b/>
+          <w:bCs/>
+        </w:rPr>
+      </w:pPr>
+      <w:r>
+        <w:rPr>
+          <w:b/>
+          <w:bCs/>
+        </w:rPr>
+        <w:t xml:space="preserve">Log out: </w:t>
+      </w:r>
+    </w:p>
+    <w:p>
+      <w:pPr>
+        <w:pStyle w:val="ListParagraph"/>
+        <w:numPr>
+          <w:ilvl w:val="1"/>
+          <w:numId w:val="4"/>
+        </w:numPr>
+      </w:pPr>
+      <w:r>
+        <w:t>Database Interaction: Delete the access token and request token of the specific user in [Identity].[AspNetUserTokens] table in database</w:t>
+      </w:r>
+    </w:p>
+    <w:p>
+      <w:pPr>
+        <w:pStyle w:val="ListParagraph"/>
+        <w:numPr>
+          <w:ilvl w:val="1"/>
+          <w:numId w:val="4"/>
+        </w:numPr>
+      </w:pPr>
+      <w:r>
+        <w:t xml:space="preserve">Queries/ORMs: </w:t>
+      </w:r>
+    </w:p>
+    <w:p>
+      <w:pPr>
+        <w:pStyle w:val="ListParagraph"/>
+        <w:numPr>
+          <w:ilvl w:val="0"/>
+          <w:numId w:val="13"/>
+        </w:numPr>
+      </w:pPr>
+      <w:r>
         <w:t>Query 1: “SELECT” query to verify that the NormalizedUsername of the new user is in the database or not.</w:t>
       </w:r>
     </w:p>
@@ -3228,8 +3531,8 @@
       <w:pPr>
         <w:pStyle w:val="ListParagraph"/>
         <w:numPr>
-          <w:ilvl w:val="2"/>
-          <w:numId w:val="5"/>
+          <w:ilvl w:val="0"/>
+          <w:numId w:val="13"/>
         </w:numPr>
       </w:pPr>
       <w:r>
@@ -3240,8 +3543,8 @@
       <w:pPr>
         <w:pStyle w:val="ListParagraph"/>
         <w:numPr>
-          <w:ilvl w:val="2"/>
-          <w:numId w:val="5"/>
+          <w:ilvl w:val="0"/>
+          <w:numId w:val="13"/>
         </w:numPr>
       </w:pPr>
       <w:r>
@@ -3257,16 +3560,7 @@
         </w:numPr>
       </w:pPr>
       <w:r>
-        <w:t>External Services</w:t>
-      </w:r>
-      <w:r>
-        <w:t xml:space="preserve">: </w:t>
-      </w:r>
-      <w:r>
-        <w:t>Sending a confirmation email into the new user’s email</w:t>
-      </w:r>
-      <w:r>
-        <w:t xml:space="preserve"> via Gmail service</w:t>
+        <w:t>External Services: Sending a confirmation email into the new user’s email via Gmail service</w:t>
       </w:r>
     </w:p>
     <w:p>
@@ -3286,74 +3580,7 @@
           <w:b/>
           <w:bCs/>
         </w:rPr>
-        <w:t xml:space="preserve">Log out: </w:t>
-      </w:r>
-    </w:p>
-    <w:p>
-      <w:pPr>
-        <w:pStyle w:val="ListParagraph"/>
-        <w:numPr>
-          <w:ilvl w:val="1"/>
-          <w:numId w:val="4"/>
-        </w:numPr>
-      </w:pPr>
-      <w:r>
-        <w:t>API Endpoint: POST /api/Identity/user/logout</w:t>
-      </w:r>
-    </w:p>
-    <w:p>
-      <w:pPr>
-        <w:pStyle w:val="ListParagraph"/>
-        <w:numPr>
-          <w:ilvl w:val="1"/>
-          <w:numId w:val="4"/>
-        </w:numPr>
-      </w:pPr>
-      <w:r>
-        <w:t>Authorization: yes</w:t>
-      </w:r>
-    </w:p>
-    <w:p>
-      <w:pPr>
-        <w:pStyle w:val="ListParagraph"/>
-        <w:numPr>
-          <w:ilvl w:val="1"/>
-          <w:numId w:val="4"/>
-        </w:numPr>
-      </w:pPr>
-      <w:r>
-        <w:t>Request Payload: NULL</w:t>
-      </w:r>
-    </w:p>
-    <w:p>
-      <w:pPr>
-        <w:pStyle w:val="ListParagraph"/>
-        <w:numPr>
-          <w:ilvl w:val="1"/>
-          <w:numId w:val="4"/>
-        </w:numPr>
-      </w:pPr>
-      <w:r>
-        <w:t>Respond Handling: How frontent react to server’s response</w:t>
-      </w:r>
-    </w:p>
-    <w:p>
-      <w:pPr>
-        <w:pStyle w:val="ListParagraph"/>
-        <w:numPr>
-          <w:ilvl w:val="0"/>
-          <w:numId w:val="4"/>
-        </w:numPr>
-        <w:rPr>
-          <w:b/>
-          <w:bCs/>
-        </w:rPr>
-      </w:pPr>
-      <w:r>
-        <w:rPr>
-          <w:b/>
-          <w:bCs/>
-        </w:rPr>
+        <w:lastRenderedPageBreak/>
         <w:t xml:space="preserve">Login: </w:t>
       </w:r>
     </w:p>
@@ -3396,17 +3623,13 @@
         </w:numPr>
       </w:pPr>
       <w:r>
-        <w:t>Query 1: a “SELECT” query to</w:t>
-      </w:r>
-      <w:r>
-        <w:t xml:space="preserve"> [Identity].[AspNetUsers] table in</w:t>
-      </w:r>
-      <w:r>
-        <w:t xml:space="preserve"> database to get top 2 results that have the same “NormalizedEmail” as the confirm </w:t>
-      </w:r>
-      <w:r>
-        <w:lastRenderedPageBreak/>
-        <w:t>email user. In LINQ, it is the “SingleOrDefaultAsync()” method. It is executed to check whether the email is valid or not</w:t>
+        <w:t xml:space="preserve">Query 1: a “SELECT” query to [Identity].[AspNetUsers] </w:t>
+      </w:r>
+      <w:r>
+        <w:t xml:space="preserve">table in database to get the user based on </w:t>
+      </w:r>
+      <w:r>
+        <w:t xml:space="preserve">email. </w:t>
       </w:r>
     </w:p>
     <w:p>
@@ -3418,10 +3641,19 @@
         </w:numPr>
       </w:pPr>
       <w:r>
-        <w:t xml:space="preserve">Query 2: a “SELECT” query to </w:t>
-      </w:r>
-      <w:r>
-        <w:t>table [Identity[.[AspNetUserTokens] to check whether any record of the login user’s OTP token is in the database or not</w:t>
+        <w:t xml:space="preserve">Query 2: </w:t>
+      </w:r>
+      <w:r>
+        <w:t>Query 1: a “SELECT” query to</w:t>
+      </w:r>
+      <w:r>
+        <w:t xml:space="preserve"> a joint table between</w:t>
+      </w:r>
+      <w:r>
+        <w:t xml:space="preserve"> [Identity].[AspNetUsers] </w:t>
+      </w:r>
+      <w:r>
+        <w:t>and [Identity].AspNetUserRoles] tables</w:t>
       </w:r>
     </w:p>
     <w:p>
@@ -3433,7 +3665,40 @@
         </w:numPr>
       </w:pPr>
       <w:r>
-        <w:t>Query 3: an “UPDATE” or “INSERT” command to database to update an existent or insert a new record to [Identity].[AspNetUserTokens] table in database.</w:t>
+        <w:t>Query 3: Query 1: a “SELECT” query to a joint table between [Identity].[AspNetUserRoles] and [Identity].[AspNetRoleClaims] tables</w:t>
+      </w:r>
+    </w:p>
+    <w:p>
+      <w:pPr>
+        <w:pStyle w:val="ListParagraph"/>
+        <w:numPr>
+          <w:ilvl w:val="0"/>
+          <w:numId w:val="12"/>
+        </w:numPr>
+      </w:pPr>
+      <w:r>
+        <w:t>Query 4: Query 1: a “SELECT” query to a joint table between [Identity].[AspNetUsers]and [Identity].[AspNetUserTokens] tables</w:t>
+      </w:r>
+    </w:p>
+    <w:p>
+      <w:pPr>
+        <w:pStyle w:val="ListParagraph"/>
+        <w:numPr>
+          <w:ilvl w:val="0"/>
+          <w:numId w:val="12"/>
+        </w:numPr>
+      </w:pPr>
+      <w:r>
+        <w:t xml:space="preserve">Query </w:t>
+      </w:r>
+      <w:r>
+        <w:t>5</w:t>
+      </w:r>
+      <w:r>
+        <w:t xml:space="preserve">: </w:t>
+      </w:r>
+      <w:r>
+        <w:t>a DELETE command to delete OTP token from [Identity].[AspNetUserTokens] table. two “UPDATE” or “INSERT” commands to insert or update access token and refresh token belonged to a user to database</w:t>
       </w:r>
     </w:p>
     <w:p>
@@ -3662,6 +3927,7 @@
         </w:numPr>
       </w:pPr>
       <w:r>
+        <w:lastRenderedPageBreak/>
         <w:t xml:space="preserve">Query 3: An </w:t>
       </w:r>
       <w:r>
@@ -3778,79 +4044,418 @@
         </w:numPr>
       </w:pPr>
       <w:r>
+        <w:t>"email": "string"</w:t>
+      </w:r>
+    </w:p>
+    <w:p>
+      <w:pPr>
+        <w:pStyle w:val="ListParagraph"/>
+        <w:numPr>
+          <w:ilvl w:val="2"/>
+          <w:numId w:val="4"/>
+        </w:numPr>
+      </w:pPr>
+      <w:r>
+        <w:t>}</w:t>
+      </w:r>
+    </w:p>
+    <w:p>
+      <w:pPr>
+        <w:pStyle w:val="ListParagraph"/>
+        <w:numPr>
+          <w:ilvl w:val="1"/>
+          <w:numId w:val="4"/>
+        </w:numPr>
+      </w:pPr>
+      <w:r>
+        <w:t>Respond Handling: How frontent react to server’s response</w:t>
+      </w:r>
+    </w:p>
+    <w:p>
+      <w:pPr>
+        <w:pStyle w:val="ListParagraph"/>
+        <w:numPr>
+          <w:ilvl w:val="0"/>
+          <w:numId w:val="4"/>
+        </w:numPr>
+        <w:rPr>
+          <w:b/>
+          <w:bCs/>
+        </w:rPr>
+      </w:pPr>
+      <w:r>
+        <w:rPr>
+          <w:b/>
+          <w:bCs/>
+        </w:rPr>
+        <w:t xml:space="preserve">Update Profile: </w:t>
+      </w:r>
+    </w:p>
+    <w:p>
+      <w:pPr>
+        <w:pStyle w:val="ListParagraph"/>
+        <w:numPr>
+          <w:ilvl w:val="1"/>
+          <w:numId w:val="4"/>
+        </w:numPr>
+      </w:pPr>
+      <w:r>
+        <w:t>API Endpoint: PUT /api/Identity/</w:t>
+      </w:r>
+      <w:r>
+        <w:t>user/update-profile</w:t>
+      </w:r>
+    </w:p>
+    <w:p>
+      <w:pPr>
+        <w:pStyle w:val="ListParagraph"/>
+        <w:numPr>
+          <w:ilvl w:val="1"/>
+          <w:numId w:val="4"/>
+        </w:numPr>
+      </w:pPr>
+      <w:r>
+        <w:t>Authorization: Yes</w:t>
+      </w:r>
+    </w:p>
+    <w:p>
+      <w:pPr>
+        <w:pStyle w:val="ListParagraph"/>
+        <w:numPr>
+          <w:ilvl w:val="1"/>
+          <w:numId w:val="4"/>
+        </w:numPr>
+      </w:pPr>
+      <w:r>
+        <w:t xml:space="preserve">Request Payload: </w:t>
+      </w:r>
+    </w:p>
+    <w:p>
+      <w:pPr>
+        <w:pStyle w:val="ListParagraph"/>
+        <w:numPr>
+          <w:ilvl w:val="2"/>
+          <w:numId w:val="4"/>
+        </w:numPr>
+      </w:pPr>
+      <w:r>
+        <w:t>{</w:t>
+      </w:r>
+    </w:p>
+    <w:p>
+      <w:pPr>
+        <w:pStyle w:val="ListParagraph"/>
+        <w:numPr>
+          <w:ilvl w:val="2"/>
+          <w:numId w:val="4"/>
+        </w:numPr>
+      </w:pPr>
+      <w:r>
+        <w:t>"email": "string",</w:t>
+      </w:r>
+    </w:p>
+    <w:p>
+      <w:pPr>
+        <w:pStyle w:val="ListParagraph"/>
+        <w:numPr>
+          <w:ilvl w:val="2"/>
+          <w:numId w:val="4"/>
+        </w:numPr>
+      </w:pPr>
+      <w:r>
+        <w:t>"phone_number": "string",</w:t>
+      </w:r>
+    </w:p>
+    <w:p>
+      <w:pPr>
+        <w:pStyle w:val="ListParagraph"/>
+        <w:numPr>
+          <w:ilvl w:val="2"/>
+          <w:numId w:val="4"/>
+        </w:numPr>
+      </w:pPr>
+      <w:r>
+        <w:t>"day_of_birth": "2026-03-25T09:03:36.455Z"</w:t>
+      </w:r>
+    </w:p>
+    <w:p>
+      <w:pPr>
+        <w:pStyle w:val="ListParagraph"/>
+        <w:numPr>
+          <w:ilvl w:val="2"/>
+          <w:numId w:val="4"/>
+        </w:numPr>
+      </w:pPr>
+      <w:r>
+        <w:t>}</w:t>
+      </w:r>
+    </w:p>
+    <w:p>
+      <w:pPr>
+        <w:pStyle w:val="ListParagraph"/>
+        <w:numPr>
+          <w:ilvl w:val="1"/>
+          <w:numId w:val="4"/>
+        </w:numPr>
+      </w:pPr>
+      <w:r>
+        <w:t>Respond Handling: How frontent react to server’s response</w:t>
+      </w:r>
+    </w:p>
+    <w:p>
+      <w:pPr>
+        <w:pStyle w:val="ListParagraph"/>
+        <w:numPr>
+          <w:ilvl w:val="0"/>
+          <w:numId w:val="4"/>
+        </w:numPr>
+        <w:rPr>
+          <w:b/>
+          <w:bCs/>
+        </w:rPr>
+      </w:pPr>
+      <w:r>
+        <w:rPr>
+          <w:b/>
+          <w:bCs/>
+        </w:rPr>
+        <w:t xml:space="preserve">Change Password: </w:t>
+      </w:r>
+    </w:p>
+    <w:p>
+      <w:pPr>
+        <w:pStyle w:val="ListParagraph"/>
+        <w:numPr>
+          <w:ilvl w:val="1"/>
+          <w:numId w:val="4"/>
+        </w:numPr>
+      </w:pPr>
+      <w:r>
+        <w:t>API Endpoint: PUT /api/Identity/user/change-password</w:t>
+      </w:r>
+    </w:p>
+    <w:p>
+      <w:pPr>
+        <w:pStyle w:val="ListParagraph"/>
+        <w:numPr>
+          <w:ilvl w:val="1"/>
+          <w:numId w:val="4"/>
+        </w:numPr>
+      </w:pPr>
+      <w:r>
+        <w:t>Authorization: Yes</w:t>
+      </w:r>
+    </w:p>
+    <w:p>
+      <w:pPr>
+        <w:pStyle w:val="ListParagraph"/>
+        <w:numPr>
+          <w:ilvl w:val="1"/>
+          <w:numId w:val="4"/>
+        </w:numPr>
+      </w:pPr>
+      <w:r>
+        <w:t xml:space="preserve">Request Payload: </w:t>
+      </w:r>
+    </w:p>
+    <w:p>
+      <w:pPr>
+        <w:pStyle w:val="ListParagraph"/>
+        <w:numPr>
+          <w:ilvl w:val="2"/>
+          <w:numId w:val="4"/>
+        </w:numPr>
+      </w:pPr>
+      <w:r>
+        <w:t>{</w:t>
+      </w:r>
+    </w:p>
+    <w:p>
+      <w:pPr>
+        <w:pStyle w:val="ListParagraph"/>
+        <w:numPr>
+          <w:ilvl w:val="2"/>
+          <w:numId w:val="4"/>
+        </w:numPr>
+      </w:pPr>
+      <w:r>
+        <w:t>"old_password": "string",</w:t>
+      </w:r>
+    </w:p>
+    <w:p>
+      <w:pPr>
+        <w:pStyle w:val="ListParagraph"/>
+        <w:numPr>
+          <w:ilvl w:val="2"/>
+          <w:numId w:val="4"/>
+        </w:numPr>
+      </w:pPr>
+      <w:r>
+        <w:t>"new_password": "string"</w:t>
+      </w:r>
+    </w:p>
+    <w:p>
+      <w:pPr>
+        <w:pStyle w:val="ListParagraph"/>
+        <w:numPr>
+          <w:ilvl w:val="2"/>
+          <w:numId w:val="4"/>
+        </w:numPr>
+      </w:pPr>
+      <w:r>
+        <w:t>}</w:t>
+      </w:r>
+    </w:p>
+    <w:p>
+      <w:pPr>
+        <w:pStyle w:val="ListParagraph"/>
+        <w:numPr>
+          <w:ilvl w:val="1"/>
+          <w:numId w:val="4"/>
+        </w:numPr>
+      </w:pPr>
+      <w:r>
+        <w:t>Respond Handling: How frontent react to server’s response</w:t>
+      </w:r>
+    </w:p>
+    <w:p>
+      <w:pPr>
+        <w:pStyle w:val="ListParagraph"/>
+        <w:numPr>
+          <w:ilvl w:val="0"/>
+          <w:numId w:val="4"/>
+        </w:numPr>
+        <w:rPr>
+          <w:b/>
+          <w:bCs/>
+        </w:rPr>
+      </w:pPr>
+      <w:r>
+        <w:rPr>
+          <w:b/>
+          <w:bCs/>
+        </w:rPr>
+        <w:t xml:space="preserve">Forgot Password: </w:t>
+      </w:r>
+    </w:p>
+    <w:p>
+      <w:pPr>
+        <w:pStyle w:val="ListParagraph"/>
+        <w:numPr>
+          <w:ilvl w:val="1"/>
+          <w:numId w:val="4"/>
+        </w:numPr>
+      </w:pPr>
+      <w:r>
+        <w:t>API Endpoint: POST /api/Identity/user/forgot-password</w:t>
+      </w:r>
+      <w:r>
+        <w:tab/>
+      </w:r>
+    </w:p>
+    <w:p>
+      <w:pPr>
+        <w:pStyle w:val="ListParagraph"/>
+        <w:numPr>
+          <w:ilvl w:val="1"/>
+          <w:numId w:val="4"/>
+        </w:numPr>
+      </w:pPr>
+      <w:r>
+        <w:t xml:space="preserve">Request Payload: </w:t>
+      </w:r>
+    </w:p>
+    <w:p>
+      <w:pPr>
+        <w:pStyle w:val="ListParagraph"/>
+        <w:numPr>
+          <w:ilvl w:val="2"/>
+          <w:numId w:val="4"/>
+        </w:numPr>
+      </w:pPr>
+      <w:r>
+        <w:t>{</w:t>
+      </w:r>
+    </w:p>
+    <w:p>
+      <w:pPr>
+        <w:pStyle w:val="ListParagraph"/>
+        <w:numPr>
+          <w:ilvl w:val="2"/>
+          <w:numId w:val="4"/>
+        </w:numPr>
+      </w:pPr>
+      <w:r>
+        <w:t>"email": "string",</w:t>
+      </w:r>
+    </w:p>
+    <w:p>
+      <w:pPr>
+        <w:pStyle w:val="ListParagraph"/>
+        <w:numPr>
+          <w:ilvl w:val="2"/>
+          <w:numId w:val="4"/>
+        </w:numPr>
+      </w:pPr>
+      <w:r>
+        <w:t>"redirectUrl": "string"</w:t>
+      </w:r>
+    </w:p>
+    <w:p>
+      <w:pPr>
+        <w:pStyle w:val="ListParagraph"/>
+        <w:numPr>
+          <w:ilvl w:val="2"/>
+          <w:numId w:val="4"/>
+        </w:numPr>
+      </w:pPr>
+      <w:r>
+        <w:t>}</w:t>
+      </w:r>
+    </w:p>
+    <w:p>
+      <w:pPr>
+        <w:pStyle w:val="ListParagraph"/>
+        <w:numPr>
+          <w:ilvl w:val="1"/>
+          <w:numId w:val="4"/>
+        </w:numPr>
+      </w:pPr>
+      <w:r>
+        <w:t>Respond Handling: How frontent react to server’s response</w:t>
+      </w:r>
+    </w:p>
+    <w:p>
+      <w:pPr>
+        <w:pStyle w:val="ListParagraph"/>
+        <w:numPr>
+          <w:ilvl w:val="0"/>
+          <w:numId w:val="4"/>
+        </w:numPr>
+        <w:rPr>
+          <w:b/>
+          <w:bCs/>
+        </w:rPr>
+      </w:pPr>
+      <w:r>
+        <w:rPr>
+          <w:b/>
+          <w:bCs/>
+        </w:rPr>
         <w:lastRenderedPageBreak/>
-        <w:t>"email": "string"</w:t>
-      </w:r>
-    </w:p>
-    <w:p>
-      <w:pPr>
-        <w:pStyle w:val="ListParagraph"/>
-        <w:numPr>
-          <w:ilvl w:val="2"/>
-          <w:numId w:val="4"/>
-        </w:numPr>
-      </w:pPr>
-      <w:r>
-        <w:t>}</w:t>
-      </w:r>
-    </w:p>
-    <w:p>
-      <w:pPr>
-        <w:pStyle w:val="ListParagraph"/>
-        <w:numPr>
-          <w:ilvl w:val="1"/>
-          <w:numId w:val="4"/>
-        </w:numPr>
-      </w:pPr>
-      <w:r>
-        <w:t>Respond Handling: How frontent react to server’s response</w:t>
-      </w:r>
-    </w:p>
-    <w:p>
-      <w:pPr>
-        <w:pStyle w:val="ListParagraph"/>
-        <w:numPr>
-          <w:ilvl w:val="0"/>
-          <w:numId w:val="4"/>
-        </w:numPr>
-        <w:rPr>
-          <w:b/>
-          <w:bCs/>
-        </w:rPr>
-      </w:pPr>
-      <w:r>
-        <w:rPr>
-          <w:b/>
-          <w:bCs/>
-        </w:rPr>
-        <w:t xml:space="preserve">Update Profile: </w:t>
-      </w:r>
-    </w:p>
-    <w:p>
-      <w:pPr>
-        <w:pStyle w:val="ListParagraph"/>
-        <w:numPr>
-          <w:ilvl w:val="1"/>
-          <w:numId w:val="4"/>
-        </w:numPr>
-      </w:pPr>
-      <w:r>
-        <w:t>API Endpoint: PUT /api/Identity/</w:t>
-      </w:r>
-      <w:r>
-        <w:t>user/update-profile</w:t>
-      </w:r>
-    </w:p>
-    <w:p>
-      <w:pPr>
-        <w:pStyle w:val="ListParagraph"/>
-        <w:numPr>
-          <w:ilvl w:val="1"/>
-          <w:numId w:val="4"/>
-        </w:numPr>
-      </w:pPr>
-      <w:r>
-        <w:t>Authorization: Yes</w:t>
+        <w:t xml:space="preserve">Reset Password: </w:t>
+      </w:r>
+    </w:p>
+    <w:p>
+      <w:pPr>
+        <w:pStyle w:val="ListParagraph"/>
+        <w:numPr>
+          <w:ilvl w:val="1"/>
+          <w:numId w:val="4"/>
+        </w:numPr>
+      </w:pPr>
+      <w:r>
+        <w:t>API Endpoint: POST /api/Identity/user/reset-password</w:t>
       </w:r>
     </w:p>
     <w:p>
@@ -3898,345 +4503,6 @@
         </w:numPr>
       </w:pPr>
       <w:r>
-        <w:t>"phone_number": "string",</w:t>
-      </w:r>
-    </w:p>
-    <w:p>
-      <w:pPr>
-        <w:pStyle w:val="ListParagraph"/>
-        <w:numPr>
-          <w:ilvl w:val="2"/>
-          <w:numId w:val="4"/>
-        </w:numPr>
-      </w:pPr>
-      <w:r>
-        <w:t>"day_of_birth": "2026-03-25T09:03:36.455Z"</w:t>
-      </w:r>
-    </w:p>
-    <w:p>
-      <w:pPr>
-        <w:pStyle w:val="ListParagraph"/>
-        <w:numPr>
-          <w:ilvl w:val="2"/>
-          <w:numId w:val="4"/>
-        </w:numPr>
-      </w:pPr>
-      <w:r>
-        <w:t>}</w:t>
-      </w:r>
-    </w:p>
-    <w:p>
-      <w:pPr>
-        <w:pStyle w:val="ListParagraph"/>
-        <w:numPr>
-          <w:ilvl w:val="1"/>
-          <w:numId w:val="4"/>
-        </w:numPr>
-      </w:pPr>
-      <w:r>
-        <w:t>Respond Handling: How frontent react to server’s response</w:t>
-      </w:r>
-    </w:p>
-    <w:p>
-      <w:pPr>
-        <w:pStyle w:val="ListParagraph"/>
-        <w:numPr>
-          <w:ilvl w:val="0"/>
-          <w:numId w:val="4"/>
-        </w:numPr>
-        <w:rPr>
-          <w:b/>
-          <w:bCs/>
-        </w:rPr>
-      </w:pPr>
-      <w:r>
-        <w:rPr>
-          <w:b/>
-          <w:bCs/>
-        </w:rPr>
-        <w:t xml:space="preserve">Change Password: </w:t>
-      </w:r>
-    </w:p>
-    <w:p>
-      <w:pPr>
-        <w:pStyle w:val="ListParagraph"/>
-        <w:numPr>
-          <w:ilvl w:val="1"/>
-          <w:numId w:val="4"/>
-        </w:numPr>
-      </w:pPr>
-      <w:r>
-        <w:t>API Endpoint: PUT /api/Identity/user/change-password</w:t>
-      </w:r>
-    </w:p>
-    <w:p>
-      <w:pPr>
-        <w:pStyle w:val="ListParagraph"/>
-        <w:numPr>
-          <w:ilvl w:val="1"/>
-          <w:numId w:val="4"/>
-        </w:numPr>
-      </w:pPr>
-      <w:r>
-        <w:t>Authorization: Yes</w:t>
-      </w:r>
-    </w:p>
-    <w:p>
-      <w:pPr>
-        <w:pStyle w:val="ListParagraph"/>
-        <w:numPr>
-          <w:ilvl w:val="1"/>
-          <w:numId w:val="4"/>
-        </w:numPr>
-      </w:pPr>
-      <w:r>
-        <w:t xml:space="preserve">Request Payload: </w:t>
-      </w:r>
-    </w:p>
-    <w:p>
-      <w:pPr>
-        <w:pStyle w:val="ListParagraph"/>
-        <w:numPr>
-          <w:ilvl w:val="2"/>
-          <w:numId w:val="4"/>
-        </w:numPr>
-      </w:pPr>
-      <w:r>
-        <w:t>{</w:t>
-      </w:r>
-    </w:p>
-    <w:p>
-      <w:pPr>
-        <w:pStyle w:val="ListParagraph"/>
-        <w:numPr>
-          <w:ilvl w:val="2"/>
-          <w:numId w:val="4"/>
-        </w:numPr>
-      </w:pPr>
-      <w:r>
-        <w:t>"old_password": "string",</w:t>
-      </w:r>
-    </w:p>
-    <w:p>
-      <w:pPr>
-        <w:pStyle w:val="ListParagraph"/>
-        <w:numPr>
-          <w:ilvl w:val="2"/>
-          <w:numId w:val="4"/>
-        </w:numPr>
-      </w:pPr>
-      <w:r>
-        <w:t>"new_password": "string"</w:t>
-      </w:r>
-    </w:p>
-    <w:p>
-      <w:pPr>
-        <w:pStyle w:val="ListParagraph"/>
-        <w:numPr>
-          <w:ilvl w:val="2"/>
-          <w:numId w:val="4"/>
-        </w:numPr>
-      </w:pPr>
-      <w:r>
-        <w:t>}</w:t>
-      </w:r>
-    </w:p>
-    <w:p>
-      <w:pPr>
-        <w:pStyle w:val="ListParagraph"/>
-        <w:numPr>
-          <w:ilvl w:val="1"/>
-          <w:numId w:val="4"/>
-        </w:numPr>
-      </w:pPr>
-      <w:r>
-        <w:t>Respond Handling: How frontent react to server’s response</w:t>
-      </w:r>
-    </w:p>
-    <w:p>
-      <w:pPr>
-        <w:pStyle w:val="ListParagraph"/>
-        <w:numPr>
-          <w:ilvl w:val="0"/>
-          <w:numId w:val="4"/>
-        </w:numPr>
-        <w:rPr>
-          <w:b/>
-          <w:bCs/>
-        </w:rPr>
-      </w:pPr>
-      <w:r>
-        <w:rPr>
-          <w:b/>
-          <w:bCs/>
-        </w:rPr>
-        <w:t xml:space="preserve">Forgot Password: </w:t>
-      </w:r>
-    </w:p>
-    <w:p>
-      <w:pPr>
-        <w:pStyle w:val="ListParagraph"/>
-        <w:numPr>
-          <w:ilvl w:val="1"/>
-          <w:numId w:val="4"/>
-        </w:numPr>
-      </w:pPr>
-      <w:r>
-        <w:t>API Endpoint: POST /api/Identity/user/forgot-password</w:t>
-      </w:r>
-      <w:r>
-        <w:tab/>
-      </w:r>
-    </w:p>
-    <w:p>
-      <w:pPr>
-        <w:pStyle w:val="ListParagraph"/>
-        <w:numPr>
-          <w:ilvl w:val="1"/>
-          <w:numId w:val="4"/>
-        </w:numPr>
-      </w:pPr>
-      <w:r>
-        <w:t xml:space="preserve">Request Payload: </w:t>
-      </w:r>
-    </w:p>
-    <w:p>
-      <w:pPr>
-        <w:pStyle w:val="ListParagraph"/>
-        <w:numPr>
-          <w:ilvl w:val="2"/>
-          <w:numId w:val="4"/>
-        </w:numPr>
-      </w:pPr>
-      <w:r>
-        <w:t>{</w:t>
-      </w:r>
-    </w:p>
-    <w:p>
-      <w:pPr>
-        <w:pStyle w:val="ListParagraph"/>
-        <w:numPr>
-          <w:ilvl w:val="2"/>
-          <w:numId w:val="4"/>
-        </w:numPr>
-      </w:pPr>
-      <w:r>
-        <w:t>"email": "string",</w:t>
-      </w:r>
-    </w:p>
-    <w:p>
-      <w:pPr>
-        <w:pStyle w:val="ListParagraph"/>
-        <w:numPr>
-          <w:ilvl w:val="2"/>
-          <w:numId w:val="4"/>
-        </w:numPr>
-      </w:pPr>
-      <w:r>
-        <w:t>"redirectUrl": "string"</w:t>
-      </w:r>
-    </w:p>
-    <w:p>
-      <w:pPr>
-        <w:pStyle w:val="ListParagraph"/>
-        <w:numPr>
-          <w:ilvl w:val="2"/>
-          <w:numId w:val="4"/>
-        </w:numPr>
-      </w:pPr>
-      <w:r>
-        <w:t>}</w:t>
-      </w:r>
-    </w:p>
-    <w:p>
-      <w:pPr>
-        <w:pStyle w:val="ListParagraph"/>
-        <w:numPr>
-          <w:ilvl w:val="1"/>
-          <w:numId w:val="4"/>
-        </w:numPr>
-      </w:pPr>
-      <w:r>
-        <w:t>Respond Handling: How frontent react to server’s response</w:t>
-      </w:r>
-    </w:p>
-    <w:p>
-      <w:pPr>
-        <w:pStyle w:val="ListParagraph"/>
-        <w:numPr>
-          <w:ilvl w:val="0"/>
-          <w:numId w:val="4"/>
-        </w:numPr>
-        <w:rPr>
-          <w:b/>
-          <w:bCs/>
-        </w:rPr>
-      </w:pPr>
-      <w:r>
-        <w:rPr>
-          <w:b/>
-          <w:bCs/>
-        </w:rPr>
-        <w:t xml:space="preserve">Reset Password: </w:t>
-      </w:r>
-    </w:p>
-    <w:p>
-      <w:pPr>
-        <w:pStyle w:val="ListParagraph"/>
-        <w:numPr>
-          <w:ilvl w:val="1"/>
-          <w:numId w:val="4"/>
-        </w:numPr>
-      </w:pPr>
-      <w:r>
-        <w:t>API Endpoint: POST /api/Identity/user/reset-password</w:t>
-      </w:r>
-    </w:p>
-    <w:p>
-      <w:pPr>
-        <w:pStyle w:val="ListParagraph"/>
-        <w:numPr>
-          <w:ilvl w:val="1"/>
-          <w:numId w:val="4"/>
-        </w:numPr>
-      </w:pPr>
-      <w:r>
-        <w:t xml:space="preserve">Request Payload: </w:t>
-      </w:r>
-    </w:p>
-    <w:p>
-      <w:pPr>
-        <w:pStyle w:val="ListParagraph"/>
-        <w:numPr>
-          <w:ilvl w:val="2"/>
-          <w:numId w:val="4"/>
-        </w:numPr>
-      </w:pPr>
-      <w:r>
-        <w:t>{</w:t>
-      </w:r>
-    </w:p>
-    <w:p>
-      <w:pPr>
-        <w:pStyle w:val="ListParagraph"/>
-        <w:numPr>
-          <w:ilvl w:val="2"/>
-          <w:numId w:val="4"/>
-        </w:numPr>
-      </w:pPr>
-      <w:r>
-        <w:t>"email": "string",</w:t>
-      </w:r>
-    </w:p>
-    <w:p>
-      <w:pPr>
-        <w:pStyle w:val="ListParagraph"/>
-        <w:numPr>
-          <w:ilvl w:val="2"/>
-          <w:numId w:val="4"/>
-        </w:numPr>
-      </w:pPr>
-      <w:r>
         <w:t>"password": "string",</w:t>
       </w:r>
     </w:p>
@@ -4273,7 +4539,6 @@
         </w:numPr>
       </w:pPr>
       <w:r>
-        <w:lastRenderedPageBreak/>
         <w:t>}</w:t>
       </w:r>
     </w:p>
@@ -4856,6 +5121,92 @@
     </w:lvl>
   </w:abstractNum>
   <w:abstractNum w:abstractNumId="3" w15:restartNumberingAfterBreak="0">
+    <w:nsid w:val="1EBB19D0"/>
+    <w:multiLevelType w:val="hybridMultilevel"/>
+    <w:tmpl w:val="022468C0"/>
+    <w:lvl w:ilvl="0" w:tplc="04090011">
+      <w:start w:val="1"/>
+      <w:numFmt w:val="decimal"/>
+      <w:lvlText w:val="%1)"/>
+      <w:lvlJc w:val="left"/>
+      <w:pPr>
+        <w:ind w:left="2160" w:hanging="360"/>
+      </w:pPr>
+    </w:lvl>
+    <w:lvl w:ilvl="1" w:tplc="04090019" w:tentative="1">
+      <w:start w:val="1"/>
+      <w:numFmt w:val="lowerLetter"/>
+      <w:lvlText w:val="%2."/>
+      <w:lvlJc w:val="left"/>
+      <w:pPr>
+        <w:ind w:left="2880" w:hanging="360"/>
+      </w:pPr>
+    </w:lvl>
+    <w:lvl w:ilvl="2" w:tplc="0409001B" w:tentative="1">
+      <w:start w:val="1"/>
+      <w:numFmt w:val="lowerRoman"/>
+      <w:lvlText w:val="%3."/>
+      <w:lvlJc w:val="right"/>
+      <w:pPr>
+        <w:ind w:left="3600" w:hanging="180"/>
+      </w:pPr>
+    </w:lvl>
+    <w:lvl w:ilvl="3" w:tplc="0409000F" w:tentative="1">
+      <w:start w:val="1"/>
+      <w:numFmt w:val="decimal"/>
+      <w:lvlText w:val="%4."/>
+      <w:lvlJc w:val="left"/>
+      <w:pPr>
+        <w:ind w:left="4320" w:hanging="360"/>
+      </w:pPr>
+    </w:lvl>
+    <w:lvl w:ilvl="4" w:tplc="04090019" w:tentative="1">
+      <w:start w:val="1"/>
+      <w:numFmt w:val="lowerLetter"/>
+      <w:lvlText w:val="%5."/>
+      <w:lvlJc w:val="left"/>
+      <w:pPr>
+        <w:ind w:left="5040" w:hanging="360"/>
+      </w:pPr>
+    </w:lvl>
+    <w:lvl w:ilvl="5" w:tplc="0409001B" w:tentative="1">
+      <w:start w:val="1"/>
+      <w:numFmt w:val="lowerRoman"/>
+      <w:lvlText w:val="%6."/>
+      <w:lvlJc w:val="right"/>
+      <w:pPr>
+        <w:ind w:left="5760" w:hanging="180"/>
+      </w:pPr>
+    </w:lvl>
+    <w:lvl w:ilvl="6" w:tplc="0409000F" w:tentative="1">
+      <w:start w:val="1"/>
+      <w:numFmt w:val="decimal"/>
+      <w:lvlText w:val="%7."/>
+      <w:lvlJc w:val="left"/>
+      <w:pPr>
+        <w:ind w:left="6480" w:hanging="360"/>
+      </w:pPr>
+    </w:lvl>
+    <w:lvl w:ilvl="7" w:tplc="04090019" w:tentative="1">
+      <w:start w:val="1"/>
+      <w:numFmt w:val="lowerLetter"/>
+      <w:lvlText w:val="%8."/>
+      <w:lvlJc w:val="left"/>
+      <w:pPr>
+        <w:ind w:left="7200" w:hanging="360"/>
+      </w:pPr>
+    </w:lvl>
+    <w:lvl w:ilvl="8" w:tplc="0409001B" w:tentative="1">
+      <w:start w:val="1"/>
+      <w:numFmt w:val="lowerRoman"/>
+      <w:lvlText w:val="%9."/>
+      <w:lvlJc w:val="right"/>
+      <w:pPr>
+        <w:ind w:left="7920" w:hanging="180"/>
+      </w:pPr>
+    </w:lvl>
+  </w:abstractNum>
+  <w:abstractNum w:abstractNumId="4" w15:restartNumberingAfterBreak="0">
     <w:nsid w:val="2D804909"/>
     <w:multiLevelType w:val="hybridMultilevel"/>
     <w:tmpl w:val="634EFFC4"/>
@@ -4968,7 +5319,7 @@
       </w:rPr>
     </w:lvl>
   </w:abstractNum>
-  <w:abstractNum w:abstractNumId="4" w15:restartNumberingAfterBreak="0">
+  <w:abstractNum w:abstractNumId="5" w15:restartNumberingAfterBreak="0">
     <w:nsid w:val="2E4973EF"/>
     <w:multiLevelType w:val="hybridMultilevel"/>
     <w:tmpl w:val="3BF45EA6"/>
@@ -5078,7 +5429,7 @@
       </w:rPr>
     </w:lvl>
   </w:abstractNum>
-  <w:abstractNum w:abstractNumId="5" w15:restartNumberingAfterBreak="0">
+  <w:abstractNum w:abstractNumId="6" w15:restartNumberingAfterBreak="0">
     <w:nsid w:val="52734A4E"/>
     <w:multiLevelType w:val="hybridMultilevel"/>
     <w:tmpl w:val="497692F4"/>
@@ -5164,7 +5515,7 @@
       </w:pPr>
     </w:lvl>
   </w:abstractNum>
-  <w:abstractNum w:abstractNumId="6" w15:restartNumberingAfterBreak="0">
+  <w:abstractNum w:abstractNumId="7" w15:restartNumberingAfterBreak="0">
     <w:nsid w:val="5F050A8F"/>
     <w:multiLevelType w:val="hybridMultilevel"/>
     <w:tmpl w:val="7DFEE70C"/>
@@ -5277,7 +5628,7 @@
       </w:rPr>
     </w:lvl>
   </w:abstractNum>
-  <w:abstractNum w:abstractNumId="7" w15:restartNumberingAfterBreak="0">
+  <w:abstractNum w:abstractNumId="8" w15:restartNumberingAfterBreak="0">
     <w:nsid w:val="66896335"/>
     <w:multiLevelType w:val="hybridMultilevel"/>
     <w:tmpl w:val="51C219FA"/>
@@ -5363,7 +5714,7 @@
       </w:pPr>
     </w:lvl>
   </w:abstractNum>
-  <w:abstractNum w:abstractNumId="8" w15:restartNumberingAfterBreak="0">
+  <w:abstractNum w:abstractNumId="9" w15:restartNumberingAfterBreak="0">
     <w:nsid w:val="6B4B5F47"/>
     <w:multiLevelType w:val="hybridMultilevel"/>
     <w:tmpl w:val="5F1AE130"/>
@@ -5476,7 +5827,7 @@
       </w:rPr>
     </w:lvl>
   </w:abstractNum>
-  <w:abstractNum w:abstractNumId="9" w15:restartNumberingAfterBreak="0">
+  <w:abstractNum w:abstractNumId="10" w15:restartNumberingAfterBreak="0">
     <w:nsid w:val="6E7D72AC"/>
     <w:multiLevelType w:val="hybridMultilevel"/>
     <w:tmpl w:val="1AE4F656"/>
@@ -5589,7 +5940,7 @@
       </w:rPr>
     </w:lvl>
   </w:abstractNum>
-  <w:abstractNum w:abstractNumId="10" w15:restartNumberingAfterBreak="0">
+  <w:abstractNum w:abstractNumId="11" w15:restartNumberingAfterBreak="0">
     <w:nsid w:val="70FD66F5"/>
     <w:multiLevelType w:val="hybridMultilevel"/>
     <w:tmpl w:val="44B2D0E6"/>
@@ -5702,7 +6053,7 @@
       </w:rPr>
     </w:lvl>
   </w:abstractNum>
-  <w:abstractNum w:abstractNumId="11" w15:restartNumberingAfterBreak="0">
+  <w:abstractNum w:abstractNumId="12" w15:restartNumberingAfterBreak="0">
     <w:nsid w:val="7EF671BD"/>
     <w:multiLevelType w:val="hybridMultilevel"/>
     <w:tmpl w:val="5346F754"/>
@@ -5822,34 +6173,37 @@
     <w:abstractNumId w:val="0"/>
   </w:num>
   <w:num w:numId="3" w16cid:durableId="1991208130">
-    <w:abstractNumId w:val="10"/>
+    <w:abstractNumId w:val="11"/>
   </w:num>
   <w:num w:numId="4" w16cid:durableId="665939140">
-    <w:abstractNumId w:val="8"/>
+    <w:abstractNumId w:val="9"/>
   </w:num>
   <w:num w:numId="5" w16cid:durableId="1821266884">
+    <w:abstractNumId w:val="5"/>
+  </w:num>
+  <w:num w:numId="6" w16cid:durableId="1480532137">
     <w:abstractNumId w:val="4"/>
   </w:num>
-  <w:num w:numId="6" w16cid:durableId="1480532137">
-    <w:abstractNumId w:val="3"/>
-  </w:num>
   <w:num w:numId="7" w16cid:durableId="1891258722">
-    <w:abstractNumId w:val="6"/>
+    <w:abstractNumId w:val="7"/>
   </w:num>
   <w:num w:numId="8" w16cid:durableId="369916516">
     <w:abstractNumId w:val="2"/>
   </w:num>
   <w:num w:numId="9" w16cid:durableId="464087553">
-    <w:abstractNumId w:val="9"/>
+    <w:abstractNumId w:val="10"/>
   </w:num>
   <w:num w:numId="10" w16cid:durableId="748580417">
-    <w:abstractNumId w:val="11"/>
+    <w:abstractNumId w:val="12"/>
   </w:num>
   <w:num w:numId="11" w16cid:durableId="2125540246">
-    <w:abstractNumId w:val="5"/>
+    <w:abstractNumId w:val="6"/>
   </w:num>
   <w:num w:numId="12" w16cid:durableId="1771386495">
-    <w:abstractNumId w:val="7"/>
+    <w:abstractNumId w:val="8"/>
+  </w:num>
+  <w:num w:numId="13" w16cid:durableId="2101290764">
+    <w:abstractNumId w:val="3"/>
   </w:num>
 </w:numbering>
 </file>
@@ -6458,7 +6812,6 @@
   <w:style w:type="character" w:default="1" w:styleId="DefaultParagraphFont">
     <w:name w:val="Default Paragraph Font"/>
     <w:uiPriority w:val="1"/>
-    <w:semiHidden/>
     <w:unhideWhenUsed/>
   </w:style>
   <w:style w:type="table" w:default="1" w:styleId="TableNormal">

</xml_diff>